<commit_message>
docs: clean up lab3 report by removing unnecessary curl command examples
</commit_message>
<xml_diff>
--- a/lab3/docs/lab3-report.docx
+++ b/lab3/docs/lab3-report.docx
@@ -61,7 +61,49 @@
         <w:rPr>
           <w:rFonts w:ascii="Cambria" w:eastAsia="Cambria" w:hAnsi="Cambria" w:cs="Cambria"/>
         </w:rPr>
-        <w:t>.; Henson, Princess Terana Caram Rasonable;</w:t>
+        <w:t xml:space="preserve">.; Henson, Princess </w:t>
+      </w:r>
+      <w:proofErr w:type="spellStart"/>
+      <w:r>
+        <w:rPr>
+          <w:rFonts w:ascii="Cambria" w:eastAsia="Cambria" w:hAnsi="Cambria" w:cs="Cambria"/>
+        </w:rPr>
+        <w:t>Terana</w:t>
+      </w:r>
+      <w:proofErr w:type="spellEnd"/>
+      <w:r>
+        <w:rPr>
+          <w:rFonts w:ascii="Cambria" w:eastAsia="Cambria" w:hAnsi="Cambria" w:cs="Cambria"/>
+        </w:rPr>
+        <w:t xml:space="preserve"> </w:t>
+      </w:r>
+      <w:proofErr w:type="spellStart"/>
+      <w:r>
+        <w:rPr>
+          <w:rFonts w:ascii="Cambria" w:eastAsia="Cambria" w:hAnsi="Cambria" w:cs="Cambria"/>
+        </w:rPr>
+        <w:t>Caram</w:t>
+      </w:r>
+      <w:proofErr w:type="spellEnd"/>
+      <w:r>
+        <w:rPr>
+          <w:rFonts w:ascii="Cambria" w:eastAsia="Cambria" w:hAnsi="Cambria" w:cs="Cambria"/>
+        </w:rPr>
+        <w:t xml:space="preserve"> </w:t>
+      </w:r>
+      <w:proofErr w:type="spellStart"/>
+      <w:r>
+        <w:rPr>
+          <w:rFonts w:ascii="Cambria" w:eastAsia="Cambria" w:hAnsi="Cambria" w:cs="Cambria"/>
+        </w:rPr>
+        <w:t>Rasonable</w:t>
+      </w:r>
+      <w:proofErr w:type="spellEnd"/>
+      <w:r>
+        <w:rPr>
+          <w:rFonts w:ascii="Cambria" w:eastAsia="Cambria" w:hAnsi="Cambria" w:cs="Cambria"/>
+        </w:rPr>
+        <w:t>;</w:t>
       </w:r>
     </w:p>
     <w:p>
@@ -73,11 +115,61 @@
           <w:rFonts w:ascii="Cambria" w:hAnsi="Cambria"/>
         </w:rPr>
       </w:pPr>
-      <w:r>
-        <w:rPr>
-          <w:rFonts w:ascii="Cambria" w:eastAsia="Cambria" w:hAnsi="Cambria" w:cs="Cambria"/>
-        </w:rPr>
-        <w:t>Gargarita, Trisha Faith Casiano; Mogat, Ela Mae Trojillo;</w:t>
+      <w:proofErr w:type="spellStart"/>
+      <w:r>
+        <w:rPr>
+          <w:rFonts w:ascii="Cambria" w:eastAsia="Cambria" w:hAnsi="Cambria" w:cs="Cambria"/>
+        </w:rPr>
+        <w:t>Gargarita</w:t>
+      </w:r>
+      <w:proofErr w:type="spellEnd"/>
+      <w:r>
+        <w:rPr>
+          <w:rFonts w:ascii="Cambria" w:eastAsia="Cambria" w:hAnsi="Cambria" w:cs="Cambria"/>
+        </w:rPr>
+        <w:t xml:space="preserve">, Trisha Faith </w:t>
+      </w:r>
+      <w:proofErr w:type="spellStart"/>
+      <w:r>
+        <w:rPr>
+          <w:rFonts w:ascii="Cambria" w:eastAsia="Cambria" w:hAnsi="Cambria" w:cs="Cambria"/>
+        </w:rPr>
+        <w:t>Casiano</w:t>
+      </w:r>
+      <w:proofErr w:type="spellEnd"/>
+      <w:r>
+        <w:rPr>
+          <w:rFonts w:ascii="Cambria" w:eastAsia="Cambria" w:hAnsi="Cambria" w:cs="Cambria"/>
+        </w:rPr>
+        <w:t xml:space="preserve">; </w:t>
+      </w:r>
+      <w:proofErr w:type="spellStart"/>
+      <w:r>
+        <w:rPr>
+          <w:rFonts w:ascii="Cambria" w:eastAsia="Cambria" w:hAnsi="Cambria" w:cs="Cambria"/>
+        </w:rPr>
+        <w:t>Mogat</w:t>
+      </w:r>
+      <w:proofErr w:type="spellEnd"/>
+      <w:r>
+        <w:rPr>
+          <w:rFonts w:ascii="Cambria" w:eastAsia="Cambria" w:hAnsi="Cambria" w:cs="Cambria"/>
+        </w:rPr>
+        <w:t xml:space="preserve">, Ela Mae </w:t>
+      </w:r>
+      <w:proofErr w:type="spellStart"/>
+      <w:r>
+        <w:rPr>
+          <w:rFonts w:ascii="Cambria" w:eastAsia="Cambria" w:hAnsi="Cambria" w:cs="Cambria"/>
+        </w:rPr>
+        <w:t>Trojillo</w:t>
+      </w:r>
+      <w:proofErr w:type="spellEnd"/>
+      <w:r>
+        <w:rPr>
+          <w:rFonts w:ascii="Cambria" w:eastAsia="Cambria" w:hAnsi="Cambria" w:cs="Cambria"/>
+        </w:rPr>
+        <w:t>;</w:t>
       </w:r>
     </w:p>
     <w:p>
@@ -89,12 +181,42 @@
           <w:rFonts w:ascii="Cambria" w:hAnsi="Cambria"/>
         </w:rPr>
       </w:pPr>
-      <w:r>
-        <w:rPr>
-          <w:rFonts w:ascii="Cambria" w:eastAsia="Cambria" w:hAnsi="Cambria" w:cs="Cambria"/>
-        </w:rPr>
-        <w:t>Tibo-oc, Paul Felippe Gelle</w:t>
-      </w:r>
+      <w:proofErr w:type="spellStart"/>
+      <w:r>
+        <w:rPr>
+          <w:rFonts w:ascii="Cambria" w:eastAsia="Cambria" w:hAnsi="Cambria" w:cs="Cambria"/>
+        </w:rPr>
+        <w:t>Tibo-oc</w:t>
+      </w:r>
+      <w:proofErr w:type="spellEnd"/>
+      <w:r>
+        <w:rPr>
+          <w:rFonts w:ascii="Cambria" w:eastAsia="Cambria" w:hAnsi="Cambria" w:cs="Cambria"/>
+        </w:rPr>
+        <w:t xml:space="preserve">, Paul </w:t>
+      </w:r>
+      <w:proofErr w:type="spellStart"/>
+      <w:r>
+        <w:rPr>
+          <w:rFonts w:ascii="Cambria" w:eastAsia="Cambria" w:hAnsi="Cambria" w:cs="Cambria"/>
+        </w:rPr>
+        <w:t>Felippe</w:t>
+      </w:r>
+      <w:proofErr w:type="spellEnd"/>
+      <w:r>
+        <w:rPr>
+          <w:rFonts w:ascii="Cambria" w:eastAsia="Cambria" w:hAnsi="Cambria" w:cs="Cambria"/>
+        </w:rPr>
+        <w:t xml:space="preserve"> </w:t>
+      </w:r>
+      <w:proofErr w:type="spellStart"/>
+      <w:r>
+        <w:rPr>
+          <w:rFonts w:ascii="Cambria" w:eastAsia="Cambria" w:hAnsi="Cambria" w:cs="Cambria"/>
+        </w:rPr>
+        <w:t>Gelle</w:t>
+      </w:r>
+      <w:proofErr w:type="spellEnd"/>
     </w:p>
     <w:p>
       <w:pPr>
@@ -111,8 +233,6 @@
         </w:rPr>
         <w:t>Information Technology, College of Computer Studies</w:t>
       </w:r>
-      <w:bookmarkStart w:id="0" w:name="_GoBack"/>
-      <w:bookmarkEnd w:id="0"/>
     </w:p>
     <w:p>
       <w:pPr>
@@ -127,7 +247,21 @@
         <w:rPr>
           <w:rFonts w:ascii="Cambria" w:eastAsia="Cambria" w:hAnsi="Cambria" w:cs="Cambria"/>
         </w:rPr>
-        <w:t>Carlos Hilado Memorial State University</w:t>
+        <w:t xml:space="preserve">Carlos </w:t>
+      </w:r>
+      <w:proofErr w:type="spellStart"/>
+      <w:r>
+        <w:rPr>
+          <w:rFonts w:ascii="Cambria" w:eastAsia="Cambria" w:hAnsi="Cambria" w:cs="Cambria"/>
+        </w:rPr>
+        <w:t>Hilado</w:t>
+      </w:r>
+      <w:proofErr w:type="spellEnd"/>
+      <w:r>
+        <w:rPr>
+          <w:rFonts w:ascii="Cambria" w:eastAsia="Cambria" w:hAnsi="Cambria" w:cs="Cambria"/>
+        </w:rPr>
+        <w:t xml:space="preserve"> Memorial State University</w:t>
       </w:r>
     </w:p>
     <w:p>
@@ -189,7 +323,23 @@
         <w:rPr>
           <w:rFonts w:ascii="Cambria" w:eastAsia="Cambria" w:hAnsi="Cambria" w:cs="Cambria"/>
         </w:rPr>
-        <w:t>Business logic refers to the rules and processes that control how data is created, modified, and validated within a system. It acts as the decision-making layer between the presentation layer and the data layer. In this lab, the presentation layer is the curl client sending HTTP requests, the business logic layer is the Express controller enforcing order rules, and the data layer is the products.json file storing product information and stock levels.</w:t>
+        <w:t xml:space="preserve">Business logic refers to the rules and processes that control how data is created, modified, and validated within a system. It acts as the decision-making layer between the presentation layer and the data layer. In this lab, the presentation layer is the curl client sending HTTP requests, the business logic layer is the Express controller enforcing order rules, and the data layer is the </w:t>
+      </w:r>
+      <w:proofErr w:type="spellStart"/>
+      <w:proofErr w:type="gramStart"/>
+      <w:r>
+        <w:rPr>
+          <w:rFonts w:ascii="Cambria" w:eastAsia="Cambria" w:hAnsi="Cambria" w:cs="Cambria"/>
+        </w:rPr>
+        <w:t>products.json</w:t>
+      </w:r>
+      <w:proofErr w:type="spellEnd"/>
+      <w:proofErr w:type="gramEnd"/>
+      <w:r>
+        <w:rPr>
+          <w:rFonts w:ascii="Cambria" w:eastAsia="Cambria" w:hAnsi="Cambria" w:cs="Cambria"/>
+        </w:rPr>
+        <w:t xml:space="preserve"> file storing product information and stock levels.</w:t>
       </w:r>
     </w:p>
     <w:p>
@@ -279,6 +429,7 @@
         <w:rPr>
           <w:rFonts w:ascii="Cambria" w:hAnsi="Cambria"/>
           <w:noProof/>
+          <w:lang w:eastAsia="en-PH"/>
         </w:rPr>
         <mc:AlternateContent>
           <mc:Choice Requires="wpg">
@@ -455,8 +606,33 @@
           <w:rFonts w:ascii="Cambria" w:hAnsi="Cambria"/>
           <w:b/>
         </w:rPr>
-        <w:t>Engr. Joao Roumil G. Vergara, CpE</w:t>
-      </w:r>
+        <w:t xml:space="preserve">Engr. Joao </w:t>
+      </w:r>
+      <w:proofErr w:type="spellStart"/>
+      <w:r>
+        <w:rPr>
+          <w:rFonts w:ascii="Cambria" w:hAnsi="Cambria"/>
+          <w:b/>
+        </w:rPr>
+        <w:t>Roumil</w:t>
+      </w:r>
+      <w:proofErr w:type="spellEnd"/>
+      <w:r>
+        <w:rPr>
+          <w:rFonts w:ascii="Cambria" w:hAnsi="Cambria"/>
+          <w:b/>
+        </w:rPr>
+        <w:t xml:space="preserve"> G. Vergara, </w:t>
+      </w:r>
+      <w:proofErr w:type="spellStart"/>
+      <w:r>
+        <w:rPr>
+          <w:rFonts w:ascii="Cambria" w:hAnsi="Cambria"/>
+          <w:b/>
+        </w:rPr>
+        <w:t>CpE</w:t>
+      </w:r>
+      <w:proofErr w:type="spellEnd"/>
     </w:p>
     <w:p>
       <w:pPr>
@@ -495,7 +671,51 @@
         <w:rPr>
           <w:rFonts w:ascii="Cambria" w:eastAsia="Cambria" w:hAnsi="Cambria" w:cs="Cambria"/>
         </w:rPr>
-        <w:t>The system separates concerns across three layers following the architecture described in the lab objectives. The presentation layer consists of curl commands that send HTTP requests. The business logic layer is implemented in controllers/orderController.js — the only file in the project that makes data decisions. The data layer is data/products.json, a JSON file that stores the five products and their current stock values. When an order succeeds, the controller writes the updated stock back to the file using fs.writeFileSync.</w:t>
+        <w:t xml:space="preserve">The system separates </w:t>
+      </w:r>
+      <w:proofErr w:type="gramStart"/>
+      <w:r>
+        <w:rPr>
+          <w:rFonts w:ascii="Cambria" w:eastAsia="Cambria" w:hAnsi="Cambria" w:cs="Cambria"/>
+        </w:rPr>
+        <w:t>concerns</w:t>
+      </w:r>
+      <w:proofErr w:type="gramEnd"/>
+      <w:r>
+        <w:rPr>
+          <w:rFonts w:ascii="Cambria" w:eastAsia="Cambria" w:hAnsi="Cambria" w:cs="Cambria"/>
+        </w:rPr>
+        <w:t xml:space="preserve"> across three layers following the architecture described in the lab objectives. The presentation layer consists of curl commands that send HTTP requests. The business logic layer is implemented in controllers/orderController.js — the only file in the project that makes data decisions. The data layer is data/</w:t>
+      </w:r>
+      <w:proofErr w:type="spellStart"/>
+      <w:r>
+        <w:rPr>
+          <w:rFonts w:ascii="Cambria" w:eastAsia="Cambria" w:hAnsi="Cambria" w:cs="Cambria"/>
+        </w:rPr>
+        <w:t>products.json</w:t>
+      </w:r>
+      <w:proofErr w:type="spellEnd"/>
+      <w:r>
+        <w:rPr>
+          <w:rFonts w:ascii="Cambria" w:eastAsia="Cambria" w:hAnsi="Cambria" w:cs="Cambria"/>
+        </w:rPr>
+        <w:t xml:space="preserve">, a JSON file that stores the five products and their current stock values. When an order succeeds, the controller writes the updated stock back to the file using </w:t>
+      </w:r>
+      <w:proofErr w:type="spellStart"/>
+      <w:proofErr w:type="gramStart"/>
+      <w:r>
+        <w:rPr>
+          <w:rFonts w:ascii="Cambria" w:eastAsia="Cambria" w:hAnsi="Cambria" w:cs="Cambria"/>
+        </w:rPr>
+        <w:t>fs.writeFileSync</w:t>
+      </w:r>
+      <w:proofErr w:type="spellEnd"/>
+      <w:proofErr w:type="gramEnd"/>
+      <w:r>
+        <w:rPr>
+          <w:rFonts w:ascii="Cambria" w:eastAsia="Cambria" w:hAnsi="Cambria" w:cs="Cambria"/>
+        </w:rPr>
+        <w:t>.</w:t>
       </w:r>
     </w:p>
     <w:p>
@@ -510,7 +730,29 @@
         <w:rPr>
           <w:rFonts w:ascii="Cambria" w:eastAsia="Cambria" w:hAnsi="Cambria" w:cs="Cambria"/>
         </w:rPr>
-        <w:t>All five business rules execute sequentially inside the placeOrder() method. The order of execution is deliberate — field validation runs first so the controller never attempts to query the data layer with undefined values. Quantity validation runs second so invalid numbers are rejected before a product lookup is performed. Product existence is verified third. Stock availability is checked fourth and fifth. Each rule returns a specific ERROR_CODE and HTTP status code immediately, stopping further execution.</w:t>
+        <w:t xml:space="preserve">All five business rules execute sequentially inside the </w:t>
+      </w:r>
+      <w:proofErr w:type="spellStart"/>
+      <w:proofErr w:type="gramStart"/>
+      <w:r>
+        <w:rPr>
+          <w:rFonts w:ascii="Cambria" w:eastAsia="Cambria" w:hAnsi="Cambria" w:cs="Cambria"/>
+        </w:rPr>
+        <w:t>placeOrder</w:t>
+      </w:r>
+      <w:proofErr w:type="spellEnd"/>
+      <w:r>
+        <w:rPr>
+          <w:rFonts w:ascii="Cambria" w:eastAsia="Cambria" w:hAnsi="Cambria" w:cs="Cambria"/>
+        </w:rPr>
+        <w:t>(</w:t>
+      </w:r>
+      <w:proofErr w:type="gramEnd"/>
+      <w:r>
+        <w:rPr>
+          <w:rFonts w:ascii="Cambria" w:eastAsia="Cambria" w:hAnsi="Cambria" w:cs="Cambria"/>
+        </w:rPr>
+        <w:t>) method. The order of execution is deliberate — field validation runs first so the controller never attempts to query the data layer with undefined values. Quantity validation runs second so invalid numbers are rejected before a product lookup is performed. Product existence is verified third. Stock availability is checked fourth and fifth. Each rule returns a specific ERROR_CODE and HTTP status code immediately, stopping further execution.</w:t>
       </w:r>
     </w:p>
     <w:p>
@@ -525,90 +767,43 @@
         <w:rPr>
           <w:rFonts w:ascii="Cambria" w:eastAsia="Cambria" w:hAnsi="Cambria" w:cs="Cambria"/>
         </w:rPr>
-        <w:t>Rule 1 (VALIDATION_ERROR, 400) rejects requests missing product_id or quantity. Rule 2 (INVALID_QUANTITY, 400) rejects zero, negative, and non-integer quantities. Rule 3 (PRODUCT_NOT_FOUND, 404) rejects orders for products that do not exist in the data file. Rule 4 (OUT_OF_STOCK, 400) rejects orders when stock is already zero. Rule 5 (STOCK_EXCEEDED, 400) rejects orders when the requested quantity</w:t>
-      </w:r>
-      <w:r>
-        <w:rPr>
-          <w:rFonts w:ascii="Cambria" w:eastAsia="Cambria" w:hAnsi="Cambria" w:cs="Cambria"/>
-        </w:rPr>
-        <w:t xml:space="preserve"> </w:t>
-      </w:r>
-      <w:r>
-        <w:rPr>
-          <w:rFonts w:ascii="Cambria" w:eastAsia="Cambria" w:hAnsi="Cambria" w:cs="Cambria"/>
-        </w:rPr>
-        <w:t>exceeds available stock. If all rules pass, stock is deducted, the file is updated, and a 201 response is returned with the order summary.</w:t>
-      </w:r>
-    </w:p>
-    <w:p>
-      <w:pPr>
-        <w:shd w:val="clear" w:color="auto" w:fill="1E1E1E"/>
+        <w:t xml:space="preserve">Rule 1 (VALIDATION_ERROR, 400) rejects requests missing </w:t>
+      </w:r>
+      <w:proofErr w:type="spellStart"/>
+      <w:r>
+        <w:rPr>
+          <w:rFonts w:ascii="Cambria" w:eastAsia="Cambria" w:hAnsi="Cambria" w:cs="Cambria"/>
+        </w:rPr>
+        <w:t>product_id</w:t>
+      </w:r>
+      <w:proofErr w:type="spellEnd"/>
+      <w:r>
+        <w:rPr>
+          <w:rFonts w:ascii="Cambria" w:eastAsia="Cambria" w:hAnsi="Cambria" w:cs="Cambria"/>
+        </w:rPr>
+        <w:t xml:space="preserve"> or quantity. Rule 2 (INVALID_QUANTITY, 400) rejects zero, negative, and non-integer quantities. Rule 3 (PRODUCT_NOT_FOUND, 404) rejects orders for products that do not exist in the data file. Rule 4 (OUT_OF_STOCK, 400) rejects orders when stock is already zero. Rule 5 (STOCK_EXCEEDED, 400) rejects orders when the requested quantity exceeds available stock. If all rules pass, stock is deducted, the file is updated, and a 201 response is returned with the order summary.</w:t>
+      </w:r>
+    </w:p>
+    <w:p>
+      <w:pPr>
+        <w:spacing w:after="120"/>
+        <w:rPr>
+          <w:rFonts w:ascii="Cambria" w:hAnsi="Cambria"/>
+        </w:rPr>
+      </w:pPr>
+    </w:p>
+    <w:p>
+      <w:pPr>
         <w:spacing w:line="276" w:lineRule="auto"/>
-        <w:ind w:left="240" w:right="240"/>
-        <w:rPr>
-          <w:rFonts w:ascii="Cambria" w:hAnsi="Cambria"/>
-        </w:rPr>
-      </w:pPr>
-      <w:r>
-        <w:rPr>
-          <w:rFonts w:ascii="Cambria" w:eastAsia="Courier New" w:hAnsi="Cambria" w:cs="Courier New"/>
-          <w:color w:val="4EC9B0"/>
-        </w:rPr>
-        <w:t>curl -i -X POST http://localhost:3000/api/orders</w:t>
-      </w:r>
-    </w:p>
-    <w:p>
-      <w:pPr>
-        <w:shd w:val="clear" w:color="auto" w:fill="1E1E1E"/>
-        <w:spacing w:line="276" w:lineRule="auto"/>
-        <w:ind w:left="240" w:right="240"/>
-        <w:rPr>
-          <w:rFonts w:ascii="Cambria" w:hAnsi="Cambria"/>
-        </w:rPr>
-      </w:pPr>
-      <w:r>
-        <w:rPr>
-          <w:rFonts w:ascii="Cambria" w:eastAsia="Courier New" w:hAnsi="Cambria" w:cs="Courier New"/>
-          <w:color w:val="4EC9B0"/>
-        </w:rPr>
-        <w:t xml:space="preserve">  -H "Content-Type: application/json"</w:t>
-      </w:r>
-    </w:p>
-    <w:p>
-      <w:pPr>
-        <w:shd w:val="clear" w:color="auto" w:fill="1E1E1E"/>
-        <w:spacing w:line="276" w:lineRule="auto"/>
-        <w:ind w:left="240" w:right="240"/>
-        <w:rPr>
-          <w:rFonts w:ascii="Cambria" w:hAnsi="Cambria"/>
-        </w:rPr>
-      </w:pPr>
-      <w:r>
-        <w:rPr>
-          <w:rFonts w:ascii="Cambria" w:eastAsia="Courier New" w:hAnsi="Cambria" w:cs="Courier New"/>
-          <w:color w:val="4EC9B0"/>
-        </w:rPr>
-        <w:t xml:space="preserve">  -d '{"product_id":1,"quantity":2}'</w:t>
-      </w:r>
-    </w:p>
-    <w:p>
-      <w:pPr>
-        <w:spacing w:after="120"/>
-        <w:rPr>
-          <w:rFonts w:ascii="Cambria" w:hAnsi="Cambria"/>
-        </w:rPr>
-      </w:pPr>
-    </w:p>
-    <w:p>
-      <w:pPr>
-        <w:spacing w:line="276" w:lineRule="auto"/>
-        <w:rPr>
-          <w:rFonts w:ascii="Cambria" w:hAnsi="Cambria"/>
-        </w:rPr>
-      </w:pPr>
-      <w:r>
-        <w:rPr>
-          <w:rFonts w:ascii="Cambria" w:hAnsi="Cambria"/>
+        <w:rPr>
+          <w:rFonts w:ascii="Cambria" w:hAnsi="Cambria"/>
+        </w:rPr>
+      </w:pPr>
+      <w:r>
+        <w:rPr>
+          <w:rFonts w:ascii="Cambria" w:hAnsi="Cambria"/>
+          <w:noProof/>
+          <w:lang w:eastAsia="en-PH"/>
         </w:rPr>
         <w:drawing>
           <wp:inline distT="0" distB="0" distL="0" distR="0" wp14:anchorId="7420E3EF" wp14:editId="327F4A7D">
@@ -673,6 +868,30 @@
     </w:p>
     <w:p>
       <w:pPr>
+        <w:spacing w:line="276" w:lineRule="auto"/>
+        <w:rPr>
+          <w:rFonts w:ascii="Cambria" w:hAnsi="Cambria"/>
+        </w:rPr>
+      </w:pPr>
+    </w:p>
+    <w:p>
+      <w:pPr>
+        <w:spacing w:line="276" w:lineRule="auto"/>
+        <w:rPr>
+          <w:rFonts w:ascii="Cambria" w:hAnsi="Cambria"/>
+        </w:rPr>
+      </w:pPr>
+    </w:p>
+    <w:p>
+      <w:pPr>
+        <w:spacing w:line="276" w:lineRule="auto"/>
+        <w:rPr>
+          <w:rFonts w:ascii="Cambria" w:hAnsi="Cambria"/>
+        </w:rPr>
+      </w:pPr>
+    </w:p>
+    <w:p>
+      <w:pPr>
         <w:spacing w:after="66"/>
         <w:ind w:left="427"/>
         <w:rPr>
@@ -683,6 +902,7 @@
         <w:rPr>
           <w:rFonts w:ascii="Cambria" w:hAnsi="Cambria"/>
           <w:noProof/>
+          <w:lang w:eastAsia="en-PH"/>
         </w:rPr>
         <mc:AlternateContent>
           <mc:Choice Requires="wpg">
@@ -860,8 +1080,33 @@
           <w:rFonts w:ascii="Cambria" w:hAnsi="Cambria"/>
           <w:b/>
         </w:rPr>
-        <w:t>Engr. Joao Roumil G. Vergara, CpE</w:t>
-      </w:r>
+        <w:t xml:space="preserve">Engr. Joao </w:t>
+      </w:r>
+      <w:proofErr w:type="spellStart"/>
+      <w:r>
+        <w:rPr>
+          <w:rFonts w:ascii="Cambria" w:hAnsi="Cambria"/>
+          <w:b/>
+        </w:rPr>
+        <w:t>Roumil</w:t>
+      </w:r>
+      <w:proofErr w:type="spellEnd"/>
+      <w:r>
+        <w:rPr>
+          <w:rFonts w:ascii="Cambria" w:hAnsi="Cambria"/>
+          <w:b/>
+        </w:rPr>
+        <w:t xml:space="preserve"> G. Vergara, </w:t>
+      </w:r>
+      <w:proofErr w:type="spellStart"/>
+      <w:r>
+        <w:rPr>
+          <w:rFonts w:ascii="Cambria" w:hAnsi="Cambria"/>
+          <w:b/>
+        </w:rPr>
+        <w:t>CpE</w:t>
+      </w:r>
+      <w:proofErr w:type="spellEnd"/>
     </w:p>
     <w:p>
       <w:pPr>
@@ -899,11 +1144,31 @@
           <w:rFonts w:cs="Courier New"/>
           <w:lang w:eastAsia="en-PH"/>
         </w:rPr>
-        <w:t>curl -i http://localhost:3000/api/products</w:t>
-      </w:r>
-    </w:p>
-    <w:p>
-      <w:r>
+        <w:t>curl -</w:t>
+      </w:r>
+      <w:proofErr w:type="spellStart"/>
+      <w:r>
+        <w:rPr>
+          <w:rFonts w:cs="Courier New"/>
+          <w:lang w:eastAsia="en-PH"/>
+        </w:rPr>
+        <w:t>i</w:t>
+      </w:r>
+      <w:proofErr w:type="spellEnd"/>
+      <w:r>
+        <w:rPr>
+          <w:rFonts w:cs="Courier New"/>
+          <w:lang w:eastAsia="en-PH"/>
+        </w:rPr>
+        <w:t xml:space="preserve"> http://localhost:3000/api/products</w:t>
+      </w:r>
+    </w:p>
+    <w:p>
+      <w:r>
+        <w:rPr>
+          <w:noProof/>
+          <w:lang w:eastAsia="en-PH"/>
+        </w:rPr>
         <w:drawing>
           <wp:inline distT="0" distB="0" distL="0" distR="0" wp14:anchorId="31B6E728" wp14:editId="50CEB283">
             <wp:extent cx="5943600" cy="1971040"/>
@@ -960,11 +1225,35 @@
           <w:sz w:val="22"/>
           <w:szCs w:val="22"/>
         </w:rPr>
-        <w:t>curl -i http://localhost:3000/api/products/1</w:t>
-      </w:r>
-    </w:p>
-    <w:p>
-      <w:r>
+        <w:t>curl -</w:t>
+      </w:r>
+      <w:proofErr w:type="spellStart"/>
+      <w:r>
+        <w:rPr>
+          <w:rStyle w:val="HTMLCode"/>
+          <w:rFonts w:ascii="Cambria" w:eastAsiaTheme="minorHAnsi" w:hAnsi="Cambria"/>
+          <w:sz w:val="22"/>
+          <w:szCs w:val="22"/>
+        </w:rPr>
+        <w:t>i</w:t>
+      </w:r>
+      <w:proofErr w:type="spellEnd"/>
+      <w:r>
+        <w:rPr>
+          <w:rStyle w:val="HTMLCode"/>
+          <w:rFonts w:ascii="Cambria" w:eastAsiaTheme="minorHAnsi" w:hAnsi="Cambria"/>
+          <w:sz w:val="22"/>
+          <w:szCs w:val="22"/>
+        </w:rPr>
+        <w:t xml:space="preserve"> http://localhost:3000/api/products/1</w:t>
+      </w:r>
+    </w:p>
+    <w:p>
+      <w:r>
+        <w:rPr>
+          <w:noProof/>
+          <w:lang w:eastAsia="en-PH"/>
+        </w:rPr>
         <w:drawing>
           <wp:inline distT="0" distB="0" distL="0" distR="0" wp14:anchorId="24A32249" wp14:editId="21670411">
             <wp:extent cx="5943600" cy="1627505"/>
@@ -1024,18 +1313,19 @@
           <w:sz w:val="22"/>
           <w:szCs w:val="22"/>
         </w:rPr>
-        <w:t>curl -i -X POST http://localhost:3000/api/orders \</w:t>
-      </w:r>
-    </w:p>
-    <w:p>
-      <w:pPr>
+        <w:t>curl -</w:t>
+      </w:r>
+      <w:proofErr w:type="spellStart"/>
+      <w:r>
         <w:rPr>
           <w:rStyle w:val="HTMLCode"/>
           <w:rFonts w:ascii="Cambria" w:eastAsiaTheme="minorHAnsi" w:hAnsi="Cambria"/>
           <w:sz w:val="22"/>
           <w:szCs w:val="22"/>
         </w:rPr>
-      </w:pPr>
+        <w:t>i</w:t>
+      </w:r>
+      <w:proofErr w:type="spellEnd"/>
       <w:r>
         <w:rPr>
           <w:rStyle w:val="HTMLCode"/>
@@ -1043,30 +1333,17 @@
           <w:sz w:val="22"/>
           <w:szCs w:val="22"/>
         </w:rPr>
-        <w:t xml:space="preserve">  -H </w:t>
-      </w:r>
-      <w:r>
-        <w:rPr>
-          <w:rStyle w:val="hljs-string"/>
-          <w:rFonts w:ascii="Cambria" w:hAnsi="Cambria"/>
-        </w:rPr>
-        <w:t>"Content-Type: application/json"</w:t>
-      </w:r>
-      <w:r>
+        <w:t xml:space="preserve"> -X POST http://localhost:3000/api/orders \</w:t>
+      </w:r>
+    </w:p>
+    <w:p>
+      <w:pPr>
         <w:rPr>
           <w:rStyle w:val="HTMLCode"/>
           <w:rFonts w:ascii="Cambria" w:eastAsiaTheme="minorHAnsi" w:hAnsi="Cambria"/>
           <w:sz w:val="22"/>
           <w:szCs w:val="22"/>
         </w:rPr>
-        <w:t xml:space="preserve"> \</w:t>
-      </w:r>
-    </w:p>
-    <w:p>
-      <w:pPr>
-        <w:rPr>
-          <w:rFonts w:cs="Courier New"/>
-        </w:rPr>
       </w:pPr>
       <w:r>
         <w:rPr>
@@ -1075,6 +1352,54 @@
           <w:sz w:val="22"/>
           <w:szCs w:val="22"/>
         </w:rPr>
+        <w:t xml:space="preserve">  -H </w:t>
+      </w:r>
+      <w:r>
+        <w:rPr>
+          <w:rStyle w:val="hljs-string"/>
+          <w:rFonts w:ascii="Cambria" w:hAnsi="Cambria"/>
+        </w:rPr>
+        <w:t>"Content-Type: application/</w:t>
+      </w:r>
+      <w:proofErr w:type="spellStart"/>
+      <w:r>
+        <w:rPr>
+          <w:rStyle w:val="hljs-string"/>
+          <w:rFonts w:ascii="Cambria" w:hAnsi="Cambria"/>
+        </w:rPr>
+        <w:t>json</w:t>
+      </w:r>
+      <w:proofErr w:type="spellEnd"/>
+      <w:r>
+        <w:rPr>
+          <w:rStyle w:val="hljs-string"/>
+          <w:rFonts w:ascii="Cambria" w:hAnsi="Cambria"/>
+        </w:rPr>
+        <w:t>"</w:t>
+      </w:r>
+      <w:r>
+        <w:rPr>
+          <w:rStyle w:val="HTMLCode"/>
+          <w:rFonts w:ascii="Cambria" w:eastAsiaTheme="minorHAnsi" w:hAnsi="Cambria"/>
+          <w:sz w:val="22"/>
+          <w:szCs w:val="22"/>
+        </w:rPr>
+        <w:t xml:space="preserve"> \</w:t>
+      </w:r>
+    </w:p>
+    <w:p>
+      <w:pPr>
+        <w:rPr>
+          <w:rFonts w:cs="Courier New"/>
+        </w:rPr>
+      </w:pPr>
+      <w:r>
+        <w:rPr>
+          <w:rStyle w:val="HTMLCode"/>
+          <w:rFonts w:ascii="Cambria" w:eastAsiaTheme="minorHAnsi" w:hAnsi="Cambria"/>
+          <w:sz w:val="22"/>
+          <w:szCs w:val="22"/>
+        </w:rPr>
         <w:t xml:space="preserve">  -d </w:t>
       </w:r>
       <w:r>
@@ -1100,6 +1425,7 @@
         <w:rPr>
           <w:rFonts w:ascii="Cambria" w:hAnsi="Cambria"/>
           <w:noProof/>
+          <w:lang w:eastAsia="en-PH"/>
         </w:rPr>
         <mc:AlternateContent>
           <mc:Choice Requires="wpg">
@@ -1277,11 +1603,40 @@
           <w:rFonts w:ascii="Cambria" w:hAnsi="Cambria"/>
           <w:b/>
         </w:rPr>
-        <w:t>Engr. Joao Roumil G. Vergara, CpE</w:t>
-      </w:r>
-    </w:p>
-    <w:p>
-      <w:r>
+        <w:t xml:space="preserve">Engr. Joao </w:t>
+      </w:r>
+      <w:proofErr w:type="spellStart"/>
+      <w:r>
+        <w:rPr>
+          <w:rFonts w:ascii="Cambria" w:hAnsi="Cambria"/>
+          <w:b/>
+        </w:rPr>
+        <w:t>Roumil</w:t>
+      </w:r>
+      <w:proofErr w:type="spellEnd"/>
+      <w:r>
+        <w:rPr>
+          <w:rFonts w:ascii="Cambria" w:hAnsi="Cambria"/>
+          <w:b/>
+        </w:rPr>
+        <w:t xml:space="preserve"> G. Vergara, </w:t>
+      </w:r>
+      <w:proofErr w:type="spellStart"/>
+      <w:r>
+        <w:rPr>
+          <w:rFonts w:ascii="Cambria" w:hAnsi="Cambria"/>
+          <w:b/>
+        </w:rPr>
+        <w:t>CpE</w:t>
+      </w:r>
+      <w:proofErr w:type="spellEnd"/>
+    </w:p>
+    <w:p>
+      <w:r>
+        <w:rPr>
+          <w:noProof/>
+          <w:lang w:eastAsia="en-PH"/>
+        </w:rPr>
         <w:lastRenderedPageBreak/>
         <w:drawing>
           <wp:inline distT="0" distB="0" distL="0" distR="0" wp14:anchorId="0813C6D6" wp14:editId="79BFBE3B">
@@ -1339,11 +1694,35 @@
           <w:sz w:val="22"/>
           <w:szCs w:val="22"/>
         </w:rPr>
-        <w:t>curl -i http://localhost:3000/api/products/1</w:t>
-      </w:r>
-    </w:p>
-    <w:p>
-      <w:r>
+        <w:t>curl -</w:t>
+      </w:r>
+      <w:proofErr w:type="spellStart"/>
+      <w:r>
+        <w:rPr>
+          <w:rStyle w:val="HTMLCode"/>
+          <w:rFonts w:ascii="Cambria" w:eastAsiaTheme="minorHAnsi" w:hAnsi="Cambria"/>
+          <w:sz w:val="22"/>
+          <w:szCs w:val="22"/>
+        </w:rPr>
+        <w:t>i</w:t>
+      </w:r>
+      <w:proofErr w:type="spellEnd"/>
+      <w:r>
+        <w:rPr>
+          <w:rStyle w:val="HTMLCode"/>
+          <w:rFonts w:ascii="Cambria" w:eastAsiaTheme="minorHAnsi" w:hAnsi="Cambria"/>
+          <w:sz w:val="22"/>
+          <w:szCs w:val="22"/>
+        </w:rPr>
+        <w:t xml:space="preserve"> http://localhost:3000/api/products/1</w:t>
+      </w:r>
+    </w:p>
+    <w:p>
+      <w:r>
+        <w:rPr>
+          <w:noProof/>
+          <w:lang w:eastAsia="en-PH"/>
+        </w:rPr>
         <w:drawing>
           <wp:inline distT="0" distB="0" distL="0" distR="0" wp14:anchorId="4BF1CA01" wp14:editId="15DF69D9">
             <wp:extent cx="5943600" cy="1643380"/>
@@ -1408,18 +1787,19 @@
           <w:sz w:val="22"/>
           <w:szCs w:val="22"/>
         </w:rPr>
-        <w:t>curl -i -X POST http://localhost:3000/api/orders \</w:t>
-      </w:r>
-    </w:p>
-    <w:p>
-      <w:pPr>
+        <w:t>curl -</w:t>
+      </w:r>
+      <w:proofErr w:type="spellStart"/>
+      <w:r>
         <w:rPr>
           <w:rStyle w:val="HTMLCode"/>
           <w:rFonts w:ascii="Cambria" w:eastAsiaTheme="minorHAnsi" w:hAnsi="Cambria"/>
           <w:sz w:val="22"/>
           <w:szCs w:val="22"/>
         </w:rPr>
-      </w:pPr>
+        <w:t>i</w:t>
+      </w:r>
+      <w:proofErr w:type="spellEnd"/>
       <w:r>
         <w:rPr>
           <w:rStyle w:val="HTMLCode"/>
@@ -1427,30 +1807,17 @@
           <w:sz w:val="22"/>
           <w:szCs w:val="22"/>
         </w:rPr>
-        <w:t xml:space="preserve">  -H </w:t>
-      </w:r>
-      <w:r>
-        <w:rPr>
-          <w:rStyle w:val="hljs-string"/>
-          <w:rFonts w:ascii="Cambria" w:hAnsi="Cambria"/>
-        </w:rPr>
-        <w:t>"Content-Type: application/json"</w:t>
-      </w:r>
-      <w:r>
+        <w:t xml:space="preserve"> -X POST http://localhost:3000/api/orders \</w:t>
+      </w:r>
+    </w:p>
+    <w:p>
+      <w:pPr>
         <w:rPr>
           <w:rStyle w:val="HTMLCode"/>
           <w:rFonts w:ascii="Cambria" w:eastAsiaTheme="minorHAnsi" w:hAnsi="Cambria"/>
           <w:sz w:val="22"/>
           <w:szCs w:val="22"/>
         </w:rPr>
-        <w:t xml:space="preserve"> \</w:t>
-      </w:r>
-    </w:p>
-    <w:p>
-      <w:pPr>
-        <w:rPr>
-          <w:rFonts w:cs="Courier New"/>
-        </w:rPr>
       </w:pPr>
       <w:r>
         <w:rPr>
@@ -1459,6 +1826,54 @@
           <w:sz w:val="22"/>
           <w:szCs w:val="22"/>
         </w:rPr>
+        <w:t xml:space="preserve">  -H </w:t>
+      </w:r>
+      <w:r>
+        <w:rPr>
+          <w:rStyle w:val="hljs-string"/>
+          <w:rFonts w:ascii="Cambria" w:hAnsi="Cambria"/>
+        </w:rPr>
+        <w:t>"Content-Type: application/</w:t>
+      </w:r>
+      <w:proofErr w:type="spellStart"/>
+      <w:r>
+        <w:rPr>
+          <w:rStyle w:val="hljs-string"/>
+          <w:rFonts w:ascii="Cambria" w:hAnsi="Cambria"/>
+        </w:rPr>
+        <w:t>json</w:t>
+      </w:r>
+      <w:proofErr w:type="spellEnd"/>
+      <w:r>
+        <w:rPr>
+          <w:rStyle w:val="hljs-string"/>
+          <w:rFonts w:ascii="Cambria" w:hAnsi="Cambria"/>
+        </w:rPr>
+        <w:t>"</w:t>
+      </w:r>
+      <w:r>
+        <w:rPr>
+          <w:rStyle w:val="HTMLCode"/>
+          <w:rFonts w:ascii="Cambria" w:eastAsiaTheme="minorHAnsi" w:hAnsi="Cambria"/>
+          <w:sz w:val="22"/>
+          <w:szCs w:val="22"/>
+        </w:rPr>
+        <w:t xml:space="preserve"> \</w:t>
+      </w:r>
+    </w:p>
+    <w:p>
+      <w:pPr>
+        <w:rPr>
+          <w:rFonts w:cs="Courier New"/>
+        </w:rPr>
+      </w:pPr>
+      <w:r>
+        <w:rPr>
+          <w:rStyle w:val="HTMLCode"/>
+          <w:rFonts w:ascii="Cambria" w:eastAsiaTheme="minorHAnsi" w:hAnsi="Cambria"/>
+          <w:sz w:val="22"/>
+          <w:szCs w:val="22"/>
+        </w:rPr>
         <w:t xml:space="preserve">  -d </w:t>
       </w:r>
       <w:r>
@@ -1485,6 +1900,7 @@
         <w:rPr>
           <w:rFonts w:ascii="Cambria" w:hAnsi="Cambria"/>
           <w:noProof/>
+          <w:lang w:eastAsia="en-PH"/>
         </w:rPr>
         <mc:AlternateContent>
           <mc:Choice Requires="wpg">
@@ -1662,11 +2078,40 @@
           <w:rFonts w:ascii="Cambria" w:hAnsi="Cambria"/>
           <w:b/>
         </w:rPr>
-        <w:t>Engr. Joao Roumil G. Vergara, CpE</w:t>
-      </w:r>
-    </w:p>
-    <w:p>
-      <w:r>
+        <w:t xml:space="preserve">Engr. Joao </w:t>
+      </w:r>
+      <w:proofErr w:type="spellStart"/>
+      <w:r>
+        <w:rPr>
+          <w:rFonts w:ascii="Cambria" w:hAnsi="Cambria"/>
+          <w:b/>
+        </w:rPr>
+        <w:t>Roumil</w:t>
+      </w:r>
+      <w:proofErr w:type="spellEnd"/>
+      <w:r>
+        <w:rPr>
+          <w:rFonts w:ascii="Cambria" w:hAnsi="Cambria"/>
+          <w:b/>
+        </w:rPr>
+        <w:t xml:space="preserve"> G. Vergara, </w:t>
+      </w:r>
+      <w:proofErr w:type="spellStart"/>
+      <w:r>
+        <w:rPr>
+          <w:rFonts w:ascii="Cambria" w:hAnsi="Cambria"/>
+          <w:b/>
+        </w:rPr>
+        <w:t>CpE</w:t>
+      </w:r>
+      <w:proofErr w:type="spellEnd"/>
+    </w:p>
+    <w:p>
+      <w:r>
+        <w:rPr>
+          <w:noProof/>
+          <w:lang w:eastAsia="en-PH"/>
+        </w:rPr>
         <w:lastRenderedPageBreak/>
         <w:drawing>
           <wp:inline distT="0" distB="0" distL="0" distR="0" wp14:anchorId="36EC695F" wp14:editId="26933C8D">
@@ -1727,18 +2172,19 @@
           <w:sz w:val="22"/>
           <w:szCs w:val="22"/>
         </w:rPr>
-        <w:t>curl -i -X POST http://localhost:3000/api/orders \</w:t>
-      </w:r>
-    </w:p>
-    <w:p>
-      <w:pPr>
+        <w:t>curl -</w:t>
+      </w:r>
+      <w:proofErr w:type="spellStart"/>
+      <w:r>
         <w:rPr>
           <w:rStyle w:val="HTMLCode"/>
           <w:rFonts w:ascii="Cambria" w:eastAsiaTheme="minorHAnsi" w:hAnsi="Cambria"/>
           <w:sz w:val="22"/>
           <w:szCs w:val="22"/>
         </w:rPr>
-      </w:pPr>
+        <w:t>i</w:t>
+      </w:r>
+      <w:proofErr w:type="spellEnd"/>
       <w:r>
         <w:rPr>
           <w:rStyle w:val="HTMLCode"/>
@@ -1746,30 +2192,17 @@
           <w:sz w:val="22"/>
           <w:szCs w:val="22"/>
         </w:rPr>
-        <w:t xml:space="preserve">  -H </w:t>
-      </w:r>
-      <w:r>
-        <w:rPr>
-          <w:rStyle w:val="hljs-string"/>
-          <w:rFonts w:ascii="Cambria" w:hAnsi="Cambria"/>
-        </w:rPr>
-        <w:t>"Content-Type: application/json"</w:t>
-      </w:r>
-      <w:r>
+        <w:t xml:space="preserve"> -X POST http://localhost:3000/api/orders \</w:t>
+      </w:r>
+    </w:p>
+    <w:p>
+      <w:pPr>
         <w:rPr>
           <w:rStyle w:val="HTMLCode"/>
           <w:rFonts w:ascii="Cambria" w:eastAsiaTheme="minorHAnsi" w:hAnsi="Cambria"/>
           <w:sz w:val="22"/>
           <w:szCs w:val="22"/>
         </w:rPr>
-        <w:t xml:space="preserve"> \</w:t>
-      </w:r>
-    </w:p>
-    <w:p>
-      <w:pPr>
-        <w:rPr>
-          <w:rFonts w:cs="Courier New"/>
-        </w:rPr>
       </w:pPr>
       <w:r>
         <w:rPr>
@@ -1778,6 +2211,54 @@
           <w:sz w:val="22"/>
           <w:szCs w:val="22"/>
         </w:rPr>
+        <w:t xml:space="preserve">  -H </w:t>
+      </w:r>
+      <w:r>
+        <w:rPr>
+          <w:rStyle w:val="hljs-string"/>
+          <w:rFonts w:ascii="Cambria" w:hAnsi="Cambria"/>
+        </w:rPr>
+        <w:t>"Content-Type: application/</w:t>
+      </w:r>
+      <w:proofErr w:type="spellStart"/>
+      <w:r>
+        <w:rPr>
+          <w:rStyle w:val="hljs-string"/>
+          <w:rFonts w:ascii="Cambria" w:hAnsi="Cambria"/>
+        </w:rPr>
+        <w:t>json</w:t>
+      </w:r>
+      <w:proofErr w:type="spellEnd"/>
+      <w:r>
+        <w:rPr>
+          <w:rStyle w:val="hljs-string"/>
+          <w:rFonts w:ascii="Cambria" w:hAnsi="Cambria"/>
+        </w:rPr>
+        <w:t>"</w:t>
+      </w:r>
+      <w:r>
+        <w:rPr>
+          <w:rStyle w:val="HTMLCode"/>
+          <w:rFonts w:ascii="Cambria" w:eastAsiaTheme="minorHAnsi" w:hAnsi="Cambria"/>
+          <w:sz w:val="22"/>
+          <w:szCs w:val="22"/>
+        </w:rPr>
+        <w:t xml:space="preserve"> \</w:t>
+      </w:r>
+    </w:p>
+    <w:p>
+      <w:pPr>
+        <w:rPr>
+          <w:rFonts w:cs="Courier New"/>
+        </w:rPr>
+      </w:pPr>
+      <w:r>
+        <w:rPr>
+          <w:rStyle w:val="HTMLCode"/>
+          <w:rFonts w:ascii="Cambria" w:eastAsiaTheme="minorHAnsi" w:hAnsi="Cambria"/>
+          <w:sz w:val="22"/>
+          <w:szCs w:val="22"/>
+        </w:rPr>
         <w:t xml:space="preserve">  -d </w:t>
       </w:r>
       <w:r>
@@ -1790,6 +2271,10 @@
     </w:p>
     <w:p>
       <w:r>
+        <w:rPr>
+          <w:noProof/>
+          <w:lang w:eastAsia="en-PH"/>
+        </w:rPr>
         <w:drawing>
           <wp:inline distT="0" distB="0" distL="0" distR="0" wp14:anchorId="7986BB4B" wp14:editId="40CC36CA">
             <wp:extent cx="5943600" cy="1875155"/>
@@ -1849,18 +2334,19 @@
           <w:sz w:val="22"/>
           <w:szCs w:val="22"/>
         </w:rPr>
-        <w:t>curl -i -X POST http://localhost:3000/api/orders \</w:t>
-      </w:r>
-    </w:p>
-    <w:p>
-      <w:pPr>
+        <w:t>curl -</w:t>
+      </w:r>
+      <w:proofErr w:type="spellStart"/>
+      <w:r>
         <w:rPr>
           <w:rStyle w:val="HTMLCode"/>
           <w:rFonts w:ascii="Cambria" w:eastAsiaTheme="minorHAnsi" w:hAnsi="Cambria"/>
           <w:sz w:val="22"/>
           <w:szCs w:val="22"/>
         </w:rPr>
-      </w:pPr>
+        <w:t>i</w:t>
+      </w:r>
+      <w:proofErr w:type="spellEnd"/>
       <w:r>
         <w:rPr>
           <w:rStyle w:val="HTMLCode"/>
@@ -1868,30 +2354,17 @@
           <w:sz w:val="22"/>
           <w:szCs w:val="22"/>
         </w:rPr>
-        <w:t xml:space="preserve">  -H </w:t>
-      </w:r>
-      <w:r>
-        <w:rPr>
-          <w:rStyle w:val="hljs-string"/>
-          <w:rFonts w:ascii="Cambria" w:hAnsi="Cambria"/>
-        </w:rPr>
-        <w:t>"Content-Type: application/json"</w:t>
-      </w:r>
-      <w:r>
+        <w:t xml:space="preserve"> -X POST http://localhost:3000/api/orders \</w:t>
+      </w:r>
+    </w:p>
+    <w:p>
+      <w:pPr>
         <w:rPr>
           <w:rStyle w:val="HTMLCode"/>
           <w:rFonts w:ascii="Cambria" w:eastAsiaTheme="minorHAnsi" w:hAnsi="Cambria"/>
           <w:sz w:val="22"/>
           <w:szCs w:val="22"/>
         </w:rPr>
-        <w:t xml:space="preserve"> \</w:t>
-      </w:r>
-    </w:p>
-    <w:p>
-      <w:pPr>
-        <w:rPr>
-          <w:rFonts w:cs="Courier New"/>
-        </w:rPr>
       </w:pPr>
       <w:r>
         <w:rPr>
@@ -1900,6 +2373,54 @@
           <w:sz w:val="22"/>
           <w:szCs w:val="22"/>
         </w:rPr>
+        <w:t xml:space="preserve">  -H </w:t>
+      </w:r>
+      <w:r>
+        <w:rPr>
+          <w:rStyle w:val="hljs-string"/>
+          <w:rFonts w:ascii="Cambria" w:hAnsi="Cambria"/>
+        </w:rPr>
+        <w:t>"Content-Type: application/</w:t>
+      </w:r>
+      <w:proofErr w:type="spellStart"/>
+      <w:r>
+        <w:rPr>
+          <w:rStyle w:val="hljs-string"/>
+          <w:rFonts w:ascii="Cambria" w:hAnsi="Cambria"/>
+        </w:rPr>
+        <w:t>json</w:t>
+      </w:r>
+      <w:proofErr w:type="spellEnd"/>
+      <w:r>
+        <w:rPr>
+          <w:rStyle w:val="hljs-string"/>
+          <w:rFonts w:ascii="Cambria" w:hAnsi="Cambria"/>
+        </w:rPr>
+        <w:t>"</w:t>
+      </w:r>
+      <w:r>
+        <w:rPr>
+          <w:rStyle w:val="HTMLCode"/>
+          <w:rFonts w:ascii="Cambria" w:eastAsiaTheme="minorHAnsi" w:hAnsi="Cambria"/>
+          <w:sz w:val="22"/>
+          <w:szCs w:val="22"/>
+        </w:rPr>
+        <w:t xml:space="preserve"> \</w:t>
+      </w:r>
+    </w:p>
+    <w:p>
+      <w:pPr>
+        <w:rPr>
+          <w:rFonts w:cs="Courier New"/>
+        </w:rPr>
+      </w:pPr>
+      <w:r>
+        <w:rPr>
+          <w:rStyle w:val="HTMLCode"/>
+          <w:rFonts w:ascii="Cambria" w:eastAsiaTheme="minorHAnsi" w:hAnsi="Cambria"/>
+          <w:sz w:val="22"/>
+          <w:szCs w:val="22"/>
+        </w:rPr>
         <w:t xml:space="preserve">  -d </w:t>
       </w:r>
       <w:r>
@@ -1907,7 +2428,23 @@
           <w:rStyle w:val="hljs-string"/>
           <w:rFonts w:ascii="Cambria" w:hAnsi="Cambria"/>
         </w:rPr>
-        <w:t>'{"product_id":1,"quantity":-5}'</w:t>
+        <w:t>'{"product_id":1,"quantity</w:t>
+      </w:r>
+      <w:proofErr w:type="gramStart"/>
+      <w:r>
+        <w:rPr>
+          <w:rStyle w:val="hljs-string"/>
+          <w:rFonts w:ascii="Cambria" w:hAnsi="Cambria"/>
+        </w:rPr>
+        <w:t>":-</w:t>
+      </w:r>
+      <w:proofErr w:type="gramEnd"/>
+      <w:r>
+        <w:rPr>
+          <w:rStyle w:val="hljs-string"/>
+          <w:rFonts w:ascii="Cambria" w:hAnsi="Cambria"/>
+        </w:rPr>
+        <w:t>5}'</w:t>
       </w:r>
     </w:p>
     <w:p/>
@@ -1925,6 +2462,7 @@
         <w:rPr>
           <w:rFonts w:ascii="Cambria" w:hAnsi="Cambria"/>
           <w:noProof/>
+          <w:lang w:eastAsia="en-PH"/>
         </w:rPr>
         <mc:AlternateContent>
           <mc:Choice Requires="wpg">
@@ -2102,11 +2640,40 @@
           <w:rFonts w:ascii="Cambria" w:hAnsi="Cambria"/>
           <w:b/>
         </w:rPr>
-        <w:t>Engr. Joao Roumil G. Vergara, CpE</w:t>
-      </w:r>
-    </w:p>
-    <w:p>
-      <w:r>
+        <w:t xml:space="preserve">Engr. Joao </w:t>
+      </w:r>
+      <w:proofErr w:type="spellStart"/>
+      <w:r>
+        <w:rPr>
+          <w:rFonts w:ascii="Cambria" w:hAnsi="Cambria"/>
+          <w:b/>
+        </w:rPr>
+        <w:t>Roumil</w:t>
+      </w:r>
+      <w:proofErr w:type="spellEnd"/>
+      <w:r>
+        <w:rPr>
+          <w:rFonts w:ascii="Cambria" w:hAnsi="Cambria"/>
+          <w:b/>
+        </w:rPr>
+        <w:t xml:space="preserve"> G. Vergara, </w:t>
+      </w:r>
+      <w:proofErr w:type="spellStart"/>
+      <w:r>
+        <w:rPr>
+          <w:rFonts w:ascii="Cambria" w:hAnsi="Cambria"/>
+          <w:b/>
+        </w:rPr>
+        <w:t>CpE</w:t>
+      </w:r>
+      <w:proofErr w:type="spellEnd"/>
+    </w:p>
+    <w:p>
+      <w:r>
+        <w:rPr>
+          <w:noProof/>
+          <w:lang w:eastAsia="en-PH"/>
+        </w:rPr>
         <w:lastRenderedPageBreak/>
         <w:drawing>
           <wp:inline distT="0" distB="0" distL="0" distR="0" wp14:anchorId="755EB7AD" wp14:editId="4DB94EF3">
@@ -2167,18 +2734,19 @@
           <w:sz w:val="22"/>
           <w:szCs w:val="22"/>
         </w:rPr>
-        <w:t>curl -i -X POST http://localhost:3000/api/orders \</w:t>
-      </w:r>
-    </w:p>
-    <w:p>
-      <w:pPr>
+        <w:t>curl -</w:t>
+      </w:r>
+      <w:proofErr w:type="spellStart"/>
+      <w:r>
         <w:rPr>
           <w:rStyle w:val="HTMLCode"/>
           <w:rFonts w:ascii="Cambria" w:eastAsiaTheme="minorHAnsi" w:hAnsi="Cambria"/>
           <w:sz w:val="22"/>
           <w:szCs w:val="22"/>
         </w:rPr>
-      </w:pPr>
+        <w:t>i</w:t>
+      </w:r>
+      <w:proofErr w:type="spellEnd"/>
       <w:r>
         <w:rPr>
           <w:rStyle w:val="HTMLCode"/>
@@ -2186,30 +2754,17 @@
           <w:sz w:val="22"/>
           <w:szCs w:val="22"/>
         </w:rPr>
-        <w:t xml:space="preserve">  -H </w:t>
-      </w:r>
-      <w:r>
-        <w:rPr>
-          <w:rStyle w:val="hljs-string"/>
-          <w:rFonts w:ascii="Cambria" w:hAnsi="Cambria"/>
-        </w:rPr>
-        <w:t>"Content-Type: application/json"</w:t>
-      </w:r>
-      <w:r>
+        <w:t xml:space="preserve"> -X POST http://localhost:3000/api/orders \</w:t>
+      </w:r>
+    </w:p>
+    <w:p>
+      <w:pPr>
         <w:rPr>
           <w:rStyle w:val="HTMLCode"/>
           <w:rFonts w:ascii="Cambria" w:eastAsiaTheme="minorHAnsi" w:hAnsi="Cambria"/>
           <w:sz w:val="22"/>
           <w:szCs w:val="22"/>
         </w:rPr>
-        <w:t xml:space="preserve"> \</w:t>
-      </w:r>
-    </w:p>
-    <w:p>
-      <w:pPr>
-        <w:rPr>
-          <w:rFonts w:cs="Courier New"/>
-        </w:rPr>
       </w:pPr>
       <w:r>
         <w:rPr>
@@ -2218,6 +2773,54 @@
           <w:sz w:val="22"/>
           <w:szCs w:val="22"/>
         </w:rPr>
+        <w:t xml:space="preserve">  -H </w:t>
+      </w:r>
+      <w:r>
+        <w:rPr>
+          <w:rStyle w:val="hljs-string"/>
+          <w:rFonts w:ascii="Cambria" w:hAnsi="Cambria"/>
+        </w:rPr>
+        <w:t>"Content-Type: application/</w:t>
+      </w:r>
+      <w:proofErr w:type="spellStart"/>
+      <w:r>
+        <w:rPr>
+          <w:rStyle w:val="hljs-string"/>
+          <w:rFonts w:ascii="Cambria" w:hAnsi="Cambria"/>
+        </w:rPr>
+        <w:t>json</w:t>
+      </w:r>
+      <w:proofErr w:type="spellEnd"/>
+      <w:r>
+        <w:rPr>
+          <w:rStyle w:val="hljs-string"/>
+          <w:rFonts w:ascii="Cambria" w:hAnsi="Cambria"/>
+        </w:rPr>
+        <w:t>"</w:t>
+      </w:r>
+      <w:r>
+        <w:rPr>
+          <w:rStyle w:val="HTMLCode"/>
+          <w:rFonts w:ascii="Cambria" w:eastAsiaTheme="minorHAnsi" w:hAnsi="Cambria"/>
+          <w:sz w:val="22"/>
+          <w:szCs w:val="22"/>
+        </w:rPr>
+        <w:t xml:space="preserve"> \</w:t>
+      </w:r>
+    </w:p>
+    <w:p>
+      <w:pPr>
+        <w:rPr>
+          <w:rFonts w:cs="Courier New"/>
+        </w:rPr>
+      </w:pPr>
+      <w:r>
+        <w:rPr>
+          <w:rStyle w:val="HTMLCode"/>
+          <w:rFonts w:ascii="Cambria" w:eastAsiaTheme="minorHAnsi" w:hAnsi="Cambria"/>
+          <w:sz w:val="22"/>
+          <w:szCs w:val="22"/>
+        </w:rPr>
         <w:t xml:space="preserve">  -d </w:t>
       </w:r>
       <w:r>
@@ -2230,6 +2833,10 @@
     </w:p>
     <w:p>
       <w:r>
+        <w:rPr>
+          <w:noProof/>
+          <w:lang w:eastAsia="en-PH"/>
+        </w:rPr>
         <w:drawing>
           <wp:inline distT="0" distB="0" distL="0" distR="0" wp14:anchorId="591697B8" wp14:editId="52C746B5">
             <wp:extent cx="5943600" cy="2070100"/>
@@ -2270,7 +2877,15 @@
     <w:p/>
     <w:p>
       <w:r>
-        <w:t>Step 9 — Missing product_id (400)</w:t>
+        <w:t xml:space="preserve">Step 9 — Missing </w:t>
+      </w:r>
+      <w:proofErr w:type="spellStart"/>
+      <w:r>
+        <w:t>product_id</w:t>
+      </w:r>
+      <w:proofErr w:type="spellEnd"/>
+      <w:r>
+        <w:t xml:space="preserve"> (400)</w:t>
       </w:r>
     </w:p>
     <w:p>
@@ -2289,18 +2904,19 @@
           <w:sz w:val="22"/>
           <w:szCs w:val="22"/>
         </w:rPr>
-        <w:t>curl -i -X POST http://localhost:3000/api/orders \</w:t>
-      </w:r>
-    </w:p>
-    <w:p>
-      <w:pPr>
+        <w:t>curl -</w:t>
+      </w:r>
+      <w:proofErr w:type="spellStart"/>
+      <w:r>
         <w:rPr>
           <w:rStyle w:val="HTMLCode"/>
           <w:rFonts w:ascii="Cambria" w:eastAsiaTheme="minorHAnsi" w:hAnsi="Cambria"/>
           <w:sz w:val="22"/>
           <w:szCs w:val="22"/>
         </w:rPr>
-      </w:pPr>
+        <w:t>i</w:t>
+      </w:r>
+      <w:proofErr w:type="spellEnd"/>
       <w:r>
         <w:rPr>
           <w:rStyle w:val="HTMLCode"/>
@@ -2308,31 +2924,17 @@
           <w:sz w:val="22"/>
           <w:szCs w:val="22"/>
         </w:rPr>
-        <w:t xml:space="preserve">  -H </w:t>
-      </w:r>
-      <w:r>
-        <w:rPr>
-          <w:rStyle w:val="hljs-string"/>
-          <w:rFonts w:ascii="Cambria" w:hAnsi="Cambria"/>
-        </w:rPr>
-        <w:t>"Content-Type: application/json"</w:t>
-      </w:r>
-      <w:r>
+        <w:t xml:space="preserve"> -X POST http://localhost:3000/api/orders \</w:t>
+      </w:r>
+    </w:p>
+    <w:p>
+      <w:pPr>
         <w:rPr>
           <w:rStyle w:val="HTMLCode"/>
           <w:rFonts w:ascii="Cambria" w:eastAsiaTheme="minorHAnsi" w:hAnsi="Cambria"/>
           <w:sz w:val="22"/>
           <w:szCs w:val="22"/>
         </w:rPr>
-        <w:t xml:space="preserve"> \</w:t>
-      </w:r>
-    </w:p>
-    <w:p>
-      <w:pPr>
-        <w:rPr>
-          <w:rStyle w:val="hljs-string"/>
-          <w:rFonts w:ascii="Cambria" w:hAnsi="Cambria"/>
-        </w:rPr>
       </w:pPr>
       <w:r>
         <w:rPr>
@@ -2341,6 +2943,55 @@
           <w:sz w:val="22"/>
           <w:szCs w:val="22"/>
         </w:rPr>
+        <w:t xml:space="preserve">  -H </w:t>
+      </w:r>
+      <w:r>
+        <w:rPr>
+          <w:rStyle w:val="hljs-string"/>
+          <w:rFonts w:ascii="Cambria" w:hAnsi="Cambria"/>
+        </w:rPr>
+        <w:t>"Content-Type: application/</w:t>
+      </w:r>
+      <w:proofErr w:type="spellStart"/>
+      <w:r>
+        <w:rPr>
+          <w:rStyle w:val="hljs-string"/>
+          <w:rFonts w:ascii="Cambria" w:hAnsi="Cambria"/>
+        </w:rPr>
+        <w:t>json</w:t>
+      </w:r>
+      <w:proofErr w:type="spellEnd"/>
+      <w:r>
+        <w:rPr>
+          <w:rStyle w:val="hljs-string"/>
+          <w:rFonts w:ascii="Cambria" w:hAnsi="Cambria"/>
+        </w:rPr>
+        <w:t>"</w:t>
+      </w:r>
+      <w:r>
+        <w:rPr>
+          <w:rStyle w:val="HTMLCode"/>
+          <w:rFonts w:ascii="Cambria" w:eastAsiaTheme="minorHAnsi" w:hAnsi="Cambria"/>
+          <w:sz w:val="22"/>
+          <w:szCs w:val="22"/>
+        </w:rPr>
+        <w:t xml:space="preserve"> \</w:t>
+      </w:r>
+    </w:p>
+    <w:p>
+      <w:pPr>
+        <w:rPr>
+          <w:rStyle w:val="hljs-string"/>
+          <w:rFonts w:ascii="Cambria" w:hAnsi="Cambria"/>
+        </w:rPr>
+      </w:pPr>
+      <w:r>
+        <w:rPr>
+          <w:rStyle w:val="HTMLCode"/>
+          <w:rFonts w:ascii="Cambria" w:eastAsiaTheme="minorHAnsi" w:hAnsi="Cambria"/>
+          <w:sz w:val="22"/>
+          <w:szCs w:val="22"/>
+        </w:rPr>
         <w:t xml:space="preserve">  -d </w:t>
       </w:r>
       <w:r>
@@ -2371,6 +3022,7 @@
         <w:rPr>
           <w:rFonts w:ascii="Cambria" w:hAnsi="Cambria"/>
           <w:noProof/>
+          <w:lang w:eastAsia="en-PH"/>
         </w:rPr>
         <mc:AlternateContent>
           <mc:Choice Requires="wpg">
@@ -2554,11 +3206,40 @@
           <w:rFonts w:ascii="Cambria" w:hAnsi="Cambria"/>
           <w:b/>
         </w:rPr>
-        <w:t>Engr. Joao Roumil G. Vergara, CpE</w:t>
-      </w:r>
-    </w:p>
-    <w:p>
-      <w:r>
+        <w:t xml:space="preserve">Engr. Joao </w:t>
+      </w:r>
+      <w:proofErr w:type="spellStart"/>
+      <w:r>
+        <w:rPr>
+          <w:rFonts w:ascii="Cambria" w:hAnsi="Cambria"/>
+          <w:b/>
+        </w:rPr>
+        <w:t>Roumil</w:t>
+      </w:r>
+      <w:proofErr w:type="spellEnd"/>
+      <w:r>
+        <w:rPr>
+          <w:rFonts w:ascii="Cambria" w:hAnsi="Cambria"/>
+          <w:b/>
+        </w:rPr>
+        <w:t xml:space="preserve"> G. Vergara, </w:t>
+      </w:r>
+      <w:proofErr w:type="spellStart"/>
+      <w:r>
+        <w:rPr>
+          <w:rFonts w:ascii="Cambria" w:hAnsi="Cambria"/>
+          <w:b/>
+        </w:rPr>
+        <w:t>CpE</w:t>
+      </w:r>
+      <w:proofErr w:type="spellEnd"/>
+    </w:p>
+    <w:p>
+      <w:r>
+        <w:rPr>
+          <w:noProof/>
+          <w:lang w:eastAsia="en-PH"/>
+        </w:rPr>
         <w:lastRenderedPageBreak/>
         <w:drawing>
           <wp:inline distT="0" distB="0" distL="0" distR="0" wp14:anchorId="41F077ED" wp14:editId="4135A7B3">
@@ -2619,18 +3300,19 @@
           <w:sz w:val="22"/>
           <w:szCs w:val="22"/>
         </w:rPr>
-        <w:t>curl -i -X POST http://localhost:3000/api/orders \</w:t>
-      </w:r>
-    </w:p>
-    <w:p>
-      <w:pPr>
+        <w:t>curl -</w:t>
+      </w:r>
+      <w:proofErr w:type="spellStart"/>
+      <w:r>
         <w:rPr>
           <w:rStyle w:val="HTMLCode"/>
           <w:rFonts w:ascii="Cambria" w:eastAsiaTheme="minorHAnsi" w:hAnsi="Cambria"/>
           <w:sz w:val="22"/>
           <w:szCs w:val="22"/>
         </w:rPr>
-      </w:pPr>
+        <w:t>i</w:t>
+      </w:r>
+      <w:proofErr w:type="spellEnd"/>
       <w:r>
         <w:rPr>
           <w:rStyle w:val="HTMLCode"/>
@@ -2638,30 +3320,17 @@
           <w:sz w:val="22"/>
           <w:szCs w:val="22"/>
         </w:rPr>
-        <w:t xml:space="preserve">  -H </w:t>
-      </w:r>
-      <w:r>
-        <w:rPr>
-          <w:rStyle w:val="hljs-string"/>
-          <w:rFonts w:ascii="Cambria" w:hAnsi="Cambria"/>
-        </w:rPr>
-        <w:t>"Content-Type: application/json"</w:t>
-      </w:r>
-      <w:r>
+        <w:t xml:space="preserve"> -X POST http://localhost:3000/api/orders \</w:t>
+      </w:r>
+    </w:p>
+    <w:p>
+      <w:pPr>
         <w:rPr>
           <w:rStyle w:val="HTMLCode"/>
           <w:rFonts w:ascii="Cambria" w:eastAsiaTheme="minorHAnsi" w:hAnsi="Cambria"/>
           <w:sz w:val="22"/>
           <w:szCs w:val="22"/>
         </w:rPr>
-        <w:t xml:space="preserve"> \</w:t>
-      </w:r>
-    </w:p>
-    <w:p>
-      <w:pPr>
-        <w:rPr>
-          <w:rFonts w:cs="Courier New"/>
-        </w:rPr>
       </w:pPr>
       <w:r>
         <w:rPr>
@@ -2670,6 +3339,54 @@
           <w:sz w:val="22"/>
           <w:szCs w:val="22"/>
         </w:rPr>
+        <w:t xml:space="preserve">  -H </w:t>
+      </w:r>
+      <w:r>
+        <w:rPr>
+          <w:rStyle w:val="hljs-string"/>
+          <w:rFonts w:ascii="Cambria" w:hAnsi="Cambria"/>
+        </w:rPr>
+        <w:t>"Content-Type: application/</w:t>
+      </w:r>
+      <w:proofErr w:type="spellStart"/>
+      <w:r>
+        <w:rPr>
+          <w:rStyle w:val="hljs-string"/>
+          <w:rFonts w:ascii="Cambria" w:hAnsi="Cambria"/>
+        </w:rPr>
+        <w:t>json</w:t>
+      </w:r>
+      <w:proofErr w:type="spellEnd"/>
+      <w:r>
+        <w:rPr>
+          <w:rStyle w:val="hljs-string"/>
+          <w:rFonts w:ascii="Cambria" w:hAnsi="Cambria"/>
+        </w:rPr>
+        <w:t>"</w:t>
+      </w:r>
+      <w:r>
+        <w:rPr>
+          <w:rStyle w:val="HTMLCode"/>
+          <w:rFonts w:ascii="Cambria" w:eastAsiaTheme="minorHAnsi" w:hAnsi="Cambria"/>
+          <w:sz w:val="22"/>
+          <w:szCs w:val="22"/>
+        </w:rPr>
+        <w:t xml:space="preserve"> \</w:t>
+      </w:r>
+    </w:p>
+    <w:p>
+      <w:pPr>
+        <w:rPr>
+          <w:rFonts w:cs="Courier New"/>
+        </w:rPr>
+      </w:pPr>
+      <w:r>
+        <w:rPr>
+          <w:rStyle w:val="HTMLCode"/>
+          <w:rFonts w:ascii="Cambria" w:eastAsiaTheme="minorHAnsi" w:hAnsi="Cambria"/>
+          <w:sz w:val="22"/>
+          <w:szCs w:val="22"/>
+        </w:rPr>
         <w:t xml:space="preserve">  -d </w:t>
       </w:r>
       <w:r>
@@ -2682,6 +3399,10 @@
     </w:p>
     <w:p>
       <w:r>
+        <w:rPr>
+          <w:noProof/>
+          <w:lang w:eastAsia="en-PH"/>
+        </w:rPr>
         <w:drawing>
           <wp:inline distT="0" distB="0" distL="0" distR="0" wp14:anchorId="426F4762" wp14:editId="42124DC6">
             <wp:extent cx="5943600" cy="1897380"/>
@@ -2741,18 +3462,19 @@
           <w:sz w:val="22"/>
           <w:szCs w:val="22"/>
         </w:rPr>
-        <w:t>curl -i -X POST http://localhost:3000/api/orders \</w:t>
-      </w:r>
-    </w:p>
-    <w:p>
-      <w:pPr>
+        <w:t>curl -</w:t>
+      </w:r>
+      <w:proofErr w:type="spellStart"/>
+      <w:r>
         <w:rPr>
           <w:rStyle w:val="HTMLCode"/>
           <w:rFonts w:ascii="Cambria" w:eastAsiaTheme="minorHAnsi" w:hAnsi="Cambria"/>
           <w:sz w:val="22"/>
           <w:szCs w:val="22"/>
         </w:rPr>
-      </w:pPr>
+        <w:t>i</w:t>
+      </w:r>
+      <w:proofErr w:type="spellEnd"/>
       <w:r>
         <w:rPr>
           <w:rStyle w:val="HTMLCode"/>
@@ -2760,31 +3482,17 @@
           <w:sz w:val="22"/>
           <w:szCs w:val="22"/>
         </w:rPr>
-        <w:t xml:space="preserve">  -H </w:t>
-      </w:r>
-      <w:r>
-        <w:rPr>
-          <w:rStyle w:val="hljs-string"/>
-          <w:rFonts w:ascii="Cambria" w:hAnsi="Cambria"/>
-        </w:rPr>
-        <w:t>"Content-Type: application/json"</w:t>
-      </w:r>
-      <w:r>
+        <w:t xml:space="preserve"> -X POST http://localhost:3000/api/orders \</w:t>
+      </w:r>
+    </w:p>
+    <w:p>
+      <w:pPr>
         <w:rPr>
           <w:rStyle w:val="HTMLCode"/>
           <w:rFonts w:ascii="Cambria" w:eastAsiaTheme="minorHAnsi" w:hAnsi="Cambria"/>
           <w:sz w:val="22"/>
           <w:szCs w:val="22"/>
         </w:rPr>
-        <w:t xml:space="preserve"> \</w:t>
-      </w:r>
-    </w:p>
-    <w:p>
-      <w:pPr>
-        <w:rPr>
-          <w:rStyle w:val="hljs-string"/>
-          <w:rFonts w:ascii="Cambria" w:hAnsi="Cambria"/>
-        </w:rPr>
       </w:pPr>
       <w:r>
         <w:rPr>
@@ -2793,6 +3501,55 @@
           <w:sz w:val="22"/>
           <w:szCs w:val="22"/>
         </w:rPr>
+        <w:t xml:space="preserve">  -H </w:t>
+      </w:r>
+      <w:r>
+        <w:rPr>
+          <w:rStyle w:val="hljs-string"/>
+          <w:rFonts w:ascii="Cambria" w:hAnsi="Cambria"/>
+        </w:rPr>
+        <w:t>"Content-Type: application/</w:t>
+      </w:r>
+      <w:proofErr w:type="spellStart"/>
+      <w:r>
+        <w:rPr>
+          <w:rStyle w:val="hljs-string"/>
+          <w:rFonts w:ascii="Cambria" w:hAnsi="Cambria"/>
+        </w:rPr>
+        <w:t>json</w:t>
+      </w:r>
+      <w:proofErr w:type="spellEnd"/>
+      <w:r>
+        <w:rPr>
+          <w:rStyle w:val="hljs-string"/>
+          <w:rFonts w:ascii="Cambria" w:hAnsi="Cambria"/>
+        </w:rPr>
+        <w:t>"</w:t>
+      </w:r>
+      <w:r>
+        <w:rPr>
+          <w:rStyle w:val="HTMLCode"/>
+          <w:rFonts w:ascii="Cambria" w:eastAsiaTheme="minorHAnsi" w:hAnsi="Cambria"/>
+          <w:sz w:val="22"/>
+          <w:szCs w:val="22"/>
+        </w:rPr>
+        <w:t xml:space="preserve"> \</w:t>
+      </w:r>
+    </w:p>
+    <w:p>
+      <w:pPr>
+        <w:rPr>
+          <w:rStyle w:val="hljs-string"/>
+          <w:rFonts w:ascii="Cambria" w:hAnsi="Cambria"/>
+        </w:rPr>
+      </w:pPr>
+      <w:r>
+        <w:rPr>
+          <w:rStyle w:val="HTMLCode"/>
+          <w:rFonts w:ascii="Cambria" w:eastAsiaTheme="minorHAnsi" w:hAnsi="Cambria"/>
+          <w:sz w:val="22"/>
+          <w:szCs w:val="22"/>
+        </w:rPr>
         <w:t xml:space="preserve">  -d </w:t>
       </w:r>
       <w:r>
@@ -2831,6 +3588,7 @@
         <w:rPr>
           <w:rFonts w:ascii="Cambria" w:hAnsi="Cambria"/>
           <w:noProof/>
+          <w:lang w:eastAsia="en-PH"/>
         </w:rPr>
         <mc:AlternateContent>
           <mc:Choice Requires="wpg">
@@ -3008,11 +3766,40 @@
           <w:rFonts w:ascii="Cambria" w:hAnsi="Cambria"/>
           <w:b/>
         </w:rPr>
-        <w:t>Engr. Joao Roumil G. Vergara, CpE</w:t>
-      </w:r>
-    </w:p>
-    <w:p>
-      <w:r>
+        <w:t xml:space="preserve">Engr. Joao </w:t>
+      </w:r>
+      <w:proofErr w:type="spellStart"/>
+      <w:r>
+        <w:rPr>
+          <w:rFonts w:ascii="Cambria" w:hAnsi="Cambria"/>
+          <w:b/>
+        </w:rPr>
+        <w:t>Roumil</w:t>
+      </w:r>
+      <w:proofErr w:type="spellEnd"/>
+      <w:r>
+        <w:rPr>
+          <w:rFonts w:ascii="Cambria" w:hAnsi="Cambria"/>
+          <w:b/>
+        </w:rPr>
+        <w:t xml:space="preserve"> G. Vergara, </w:t>
+      </w:r>
+      <w:proofErr w:type="spellStart"/>
+      <w:r>
+        <w:rPr>
+          <w:rFonts w:ascii="Cambria" w:hAnsi="Cambria"/>
+          <w:b/>
+        </w:rPr>
+        <w:t>CpE</w:t>
+      </w:r>
+      <w:proofErr w:type="spellEnd"/>
+    </w:p>
+    <w:p>
+      <w:r>
+        <w:rPr>
+          <w:noProof/>
+          <w:lang w:eastAsia="en-PH"/>
+        </w:rPr>
         <w:lastRenderedPageBreak/>
         <w:drawing>
           <wp:inline distT="0" distB="0" distL="0" distR="0" wp14:anchorId="533E703B" wp14:editId="1D647654">
@@ -3078,18 +3865,19 @@
           <w:sz w:val="22"/>
           <w:szCs w:val="22"/>
         </w:rPr>
-        <w:t>curl -i -X POST http://localhost:3000/api/orders \</w:t>
-      </w:r>
-    </w:p>
-    <w:p>
-      <w:pPr>
+        <w:t>curl -</w:t>
+      </w:r>
+      <w:proofErr w:type="spellStart"/>
+      <w:r>
         <w:rPr>
           <w:rStyle w:val="HTMLCode"/>
           <w:rFonts w:ascii="Cambria" w:eastAsiaTheme="majorEastAsia" w:hAnsi="Cambria"/>
           <w:sz w:val="22"/>
           <w:szCs w:val="22"/>
         </w:rPr>
-      </w:pPr>
+        <w:t>i</w:t>
+      </w:r>
+      <w:proofErr w:type="spellEnd"/>
       <w:r>
         <w:rPr>
           <w:rStyle w:val="HTMLCode"/>
@@ -3097,30 +3885,17 @@
           <w:sz w:val="22"/>
           <w:szCs w:val="22"/>
         </w:rPr>
-        <w:t xml:space="preserve">  -H </w:t>
-      </w:r>
-      <w:r>
-        <w:rPr>
-          <w:rStyle w:val="hljs-string"/>
-          <w:rFonts w:ascii="Cambria" w:hAnsi="Cambria"/>
-        </w:rPr>
-        <w:t>"Content-Type: application/json"</w:t>
-      </w:r>
-      <w:r>
+        <w:t xml:space="preserve"> -X POST http://localhost:3000/api/orders \</w:t>
+      </w:r>
+    </w:p>
+    <w:p>
+      <w:pPr>
         <w:rPr>
           <w:rStyle w:val="HTMLCode"/>
           <w:rFonts w:ascii="Cambria" w:eastAsiaTheme="majorEastAsia" w:hAnsi="Cambria"/>
           <w:sz w:val="22"/>
           <w:szCs w:val="22"/>
         </w:rPr>
-        <w:t xml:space="preserve"> \</w:t>
-      </w:r>
-    </w:p>
-    <w:p>
-      <w:pPr>
-        <w:rPr>
-          <w:rFonts w:cs="Courier New"/>
-        </w:rPr>
       </w:pPr>
       <w:r>
         <w:rPr>
@@ -3129,6 +3904,54 @@
           <w:sz w:val="22"/>
           <w:szCs w:val="22"/>
         </w:rPr>
+        <w:t xml:space="preserve">  -H </w:t>
+      </w:r>
+      <w:r>
+        <w:rPr>
+          <w:rStyle w:val="hljs-string"/>
+          <w:rFonts w:ascii="Cambria" w:hAnsi="Cambria"/>
+        </w:rPr>
+        <w:t>"Content-Type: application/</w:t>
+      </w:r>
+      <w:proofErr w:type="spellStart"/>
+      <w:r>
+        <w:rPr>
+          <w:rStyle w:val="hljs-string"/>
+          <w:rFonts w:ascii="Cambria" w:hAnsi="Cambria"/>
+        </w:rPr>
+        <w:t>json</w:t>
+      </w:r>
+      <w:proofErr w:type="spellEnd"/>
+      <w:r>
+        <w:rPr>
+          <w:rStyle w:val="hljs-string"/>
+          <w:rFonts w:ascii="Cambria" w:hAnsi="Cambria"/>
+        </w:rPr>
+        <w:t>"</w:t>
+      </w:r>
+      <w:r>
+        <w:rPr>
+          <w:rStyle w:val="HTMLCode"/>
+          <w:rFonts w:ascii="Cambria" w:eastAsiaTheme="majorEastAsia" w:hAnsi="Cambria"/>
+          <w:sz w:val="22"/>
+          <w:szCs w:val="22"/>
+        </w:rPr>
+        <w:t xml:space="preserve"> \</w:t>
+      </w:r>
+    </w:p>
+    <w:p>
+      <w:pPr>
+        <w:rPr>
+          <w:rFonts w:cs="Courier New"/>
+        </w:rPr>
+      </w:pPr>
+      <w:r>
+        <w:rPr>
+          <w:rStyle w:val="HTMLCode"/>
+          <w:rFonts w:ascii="Cambria" w:eastAsiaTheme="majorEastAsia" w:hAnsi="Cambria"/>
+          <w:sz w:val="22"/>
+          <w:szCs w:val="22"/>
+        </w:rPr>
         <w:t xml:space="preserve">  -d </w:t>
       </w:r>
       <w:r>
@@ -3141,6 +3964,10 @@
     </w:p>
     <w:p>
       <w:r>
+        <w:rPr>
+          <w:noProof/>
+          <w:lang w:eastAsia="en-PH"/>
+        </w:rPr>
         <w:drawing>
           <wp:inline distT="0" distB="0" distL="0" distR="0" wp14:anchorId="321C47C3" wp14:editId="01F9D61D">
             <wp:extent cx="5943600" cy="1931035"/>
@@ -3200,18 +4027,19 @@
           <w:sz w:val="22"/>
           <w:szCs w:val="22"/>
         </w:rPr>
-        <w:t>curl -i -X POST http://localhost:3000/api/orders \</w:t>
-      </w:r>
-    </w:p>
-    <w:p>
-      <w:pPr>
+        <w:t>curl -</w:t>
+      </w:r>
+      <w:proofErr w:type="spellStart"/>
+      <w:r>
         <w:rPr>
           <w:rStyle w:val="HTMLCode"/>
           <w:rFonts w:ascii="Cambria" w:eastAsiaTheme="minorHAnsi" w:hAnsi="Cambria"/>
           <w:sz w:val="22"/>
           <w:szCs w:val="22"/>
         </w:rPr>
-      </w:pPr>
+        <w:t>i</w:t>
+      </w:r>
+      <w:proofErr w:type="spellEnd"/>
       <w:r>
         <w:rPr>
           <w:rStyle w:val="HTMLCode"/>
@@ -3219,31 +4047,17 @@
           <w:sz w:val="22"/>
           <w:szCs w:val="22"/>
         </w:rPr>
-        <w:t xml:space="preserve">  -H </w:t>
-      </w:r>
-      <w:r>
-        <w:rPr>
-          <w:rStyle w:val="hljs-string"/>
-          <w:rFonts w:ascii="Cambria" w:hAnsi="Cambria"/>
-        </w:rPr>
-        <w:t>"Content-Type: application/json"</w:t>
-      </w:r>
-      <w:r>
+        <w:t xml:space="preserve"> -X POST http://localhost:3000/api/orders \</w:t>
+      </w:r>
+    </w:p>
+    <w:p>
+      <w:pPr>
         <w:rPr>
           <w:rStyle w:val="HTMLCode"/>
           <w:rFonts w:ascii="Cambria" w:eastAsiaTheme="minorHAnsi" w:hAnsi="Cambria"/>
           <w:sz w:val="22"/>
           <w:szCs w:val="22"/>
         </w:rPr>
-        <w:t xml:space="preserve"> \</w:t>
-      </w:r>
-    </w:p>
-    <w:p>
-      <w:pPr>
-        <w:rPr>
-          <w:rStyle w:val="hljs-string"/>
-          <w:rFonts w:ascii="Cambria" w:hAnsi="Cambria"/>
-        </w:rPr>
       </w:pPr>
       <w:r>
         <w:rPr>
@@ -3252,6 +4066,55 @@
           <w:sz w:val="22"/>
           <w:szCs w:val="22"/>
         </w:rPr>
+        <w:t xml:space="preserve">  -H </w:t>
+      </w:r>
+      <w:r>
+        <w:rPr>
+          <w:rStyle w:val="hljs-string"/>
+          <w:rFonts w:ascii="Cambria" w:hAnsi="Cambria"/>
+        </w:rPr>
+        <w:t>"Content-Type: application/</w:t>
+      </w:r>
+      <w:proofErr w:type="spellStart"/>
+      <w:r>
+        <w:rPr>
+          <w:rStyle w:val="hljs-string"/>
+          <w:rFonts w:ascii="Cambria" w:hAnsi="Cambria"/>
+        </w:rPr>
+        <w:t>json</w:t>
+      </w:r>
+      <w:proofErr w:type="spellEnd"/>
+      <w:r>
+        <w:rPr>
+          <w:rStyle w:val="hljs-string"/>
+          <w:rFonts w:ascii="Cambria" w:hAnsi="Cambria"/>
+        </w:rPr>
+        <w:t>"</w:t>
+      </w:r>
+      <w:r>
+        <w:rPr>
+          <w:rStyle w:val="HTMLCode"/>
+          <w:rFonts w:ascii="Cambria" w:eastAsiaTheme="minorHAnsi" w:hAnsi="Cambria"/>
+          <w:sz w:val="22"/>
+          <w:szCs w:val="22"/>
+        </w:rPr>
+        <w:t xml:space="preserve"> \</w:t>
+      </w:r>
+    </w:p>
+    <w:p>
+      <w:pPr>
+        <w:rPr>
+          <w:rStyle w:val="hljs-string"/>
+          <w:rFonts w:ascii="Cambria" w:hAnsi="Cambria"/>
+        </w:rPr>
+      </w:pPr>
+      <w:r>
+        <w:rPr>
+          <w:rStyle w:val="HTMLCode"/>
+          <w:rFonts w:ascii="Cambria" w:eastAsiaTheme="minorHAnsi" w:hAnsi="Cambria"/>
+          <w:sz w:val="22"/>
+          <w:szCs w:val="22"/>
+        </w:rPr>
         <w:t xml:space="preserve">  -d </w:t>
       </w:r>
       <w:r>
@@ -3282,6 +4145,7 @@
         <w:rPr>
           <w:rFonts w:ascii="Cambria" w:hAnsi="Cambria"/>
           <w:noProof/>
+          <w:lang w:eastAsia="en-PH"/>
         </w:rPr>
         <mc:AlternateContent>
           <mc:Choice Requires="wpg">
@@ -3459,12 +4323,41 @@
           <w:rFonts w:ascii="Cambria" w:hAnsi="Cambria"/>
           <w:b/>
         </w:rPr>
-        <w:t>Engr. Joao Roumil G. Vergara, CpE</w:t>
-      </w:r>
+        <w:t xml:space="preserve">Engr. Joao </w:t>
+      </w:r>
+      <w:proofErr w:type="spellStart"/>
+      <w:r>
+        <w:rPr>
+          <w:rFonts w:ascii="Cambria" w:hAnsi="Cambria"/>
+          <w:b/>
+        </w:rPr>
+        <w:t>Roumil</w:t>
+      </w:r>
+      <w:proofErr w:type="spellEnd"/>
+      <w:r>
+        <w:rPr>
+          <w:rFonts w:ascii="Cambria" w:hAnsi="Cambria"/>
+          <w:b/>
+        </w:rPr>
+        <w:t xml:space="preserve"> G. Vergara, </w:t>
+      </w:r>
+      <w:proofErr w:type="spellStart"/>
+      <w:r>
+        <w:rPr>
+          <w:rFonts w:ascii="Cambria" w:hAnsi="Cambria"/>
+          <w:b/>
+        </w:rPr>
+        <w:t>CpE</w:t>
+      </w:r>
+      <w:proofErr w:type="spellEnd"/>
     </w:p>
     <w:p/>
     <w:p>
       <w:r>
+        <w:rPr>
+          <w:noProof/>
+          <w:lang w:eastAsia="en-PH"/>
+        </w:rPr>
         <w:lastRenderedPageBreak/>
         <w:drawing>
           <wp:inline distT="0" distB="0" distL="0" distR="0" wp14:anchorId="6897DAF1" wp14:editId="24B7498A">
@@ -3522,7 +4415,27 @@
           <w:sz w:val="22"/>
           <w:szCs w:val="22"/>
         </w:rPr>
-        <w:t>curl -i http://localhost:3000/api/nonexistent</w:t>
+        <w:t>curl -</w:t>
+      </w:r>
+      <w:proofErr w:type="spellStart"/>
+      <w:r>
+        <w:rPr>
+          <w:rStyle w:val="HTMLCode"/>
+          <w:rFonts w:ascii="Cambria" w:eastAsiaTheme="minorHAnsi" w:hAnsi="Cambria"/>
+          <w:sz w:val="22"/>
+          <w:szCs w:val="22"/>
+        </w:rPr>
+        <w:t>i</w:t>
+      </w:r>
+      <w:proofErr w:type="spellEnd"/>
+      <w:r>
+        <w:rPr>
+          <w:rStyle w:val="HTMLCode"/>
+          <w:rFonts w:ascii="Cambria" w:eastAsiaTheme="minorHAnsi" w:hAnsi="Cambria"/>
+          <w:sz w:val="22"/>
+          <w:szCs w:val="22"/>
+        </w:rPr>
+        <w:t xml:space="preserve"> http://localhost:3000/api/nonexistent</w:t>
       </w:r>
     </w:p>
     <w:p>
@@ -3535,6 +4448,8 @@
       <w:r>
         <w:rPr>
           <w:rFonts w:ascii="Cambria" w:hAnsi="Cambria"/>
+          <w:noProof/>
+          <w:lang w:eastAsia="en-PH"/>
         </w:rPr>
         <w:drawing>
           <wp:inline distT="0" distB="0" distL="0" distR="0" wp14:anchorId="69B683F2" wp14:editId="52DD40E6">
@@ -3639,6 +4554,7 @@
         <w:rPr>
           <w:rFonts w:ascii="Cambria" w:hAnsi="Cambria"/>
           <w:noProof/>
+          <w:lang w:eastAsia="en-PH"/>
         </w:rPr>
         <mc:AlternateContent>
           <mc:Choice Requires="wpg">
@@ -3816,8 +4732,33 @@
           <w:rFonts w:ascii="Cambria" w:hAnsi="Cambria"/>
           <w:b/>
         </w:rPr>
-        <w:t>Engr. Joao Roumil G. Vergara, CpE</w:t>
-      </w:r>
+        <w:t xml:space="preserve">Engr. Joao </w:t>
+      </w:r>
+      <w:proofErr w:type="spellStart"/>
+      <w:r>
+        <w:rPr>
+          <w:rFonts w:ascii="Cambria" w:hAnsi="Cambria"/>
+          <w:b/>
+        </w:rPr>
+        <w:t>Roumil</w:t>
+      </w:r>
+      <w:proofErr w:type="spellEnd"/>
+      <w:r>
+        <w:rPr>
+          <w:rFonts w:ascii="Cambria" w:hAnsi="Cambria"/>
+          <w:b/>
+        </w:rPr>
+        <w:t xml:space="preserve"> G. Vergara, </w:t>
+      </w:r>
+      <w:proofErr w:type="spellStart"/>
+      <w:r>
+        <w:rPr>
+          <w:rFonts w:ascii="Cambria" w:hAnsi="Cambria"/>
+          <w:b/>
+        </w:rPr>
+        <w:t>CpE</w:t>
+      </w:r>
+      <w:proofErr w:type="spellEnd"/>
     </w:p>
     <w:p>
       <w:pPr>
@@ -3854,12 +4795,6 @@
         <w:gridCol w:w="1593"/>
       </w:tblGrid>
       <w:tr>
-        <w:tblPrEx>
-          <w:tblCellMar>
-            <w:top w:w="0" w:type="dxa"/>
-            <w:bottom w:w="0" w:type="dxa"/>
-          </w:tblCellMar>
-        </w:tblPrEx>
         <w:trPr>
           <w:tblHeader/>
         </w:trPr>
@@ -4046,12 +4981,6 @@
         </w:tc>
       </w:tr>
       <w:tr>
-        <w:tblPrEx>
-          <w:tblCellMar>
-            <w:top w:w="0" w:type="dxa"/>
-            <w:bottom w:w="0" w:type="dxa"/>
-          </w:tblCellMar>
-        </w:tblPrEx>
         <w:tc>
           <w:tcPr>
             <w:tcW w:w="1000" w:type="dxa"/>
@@ -4221,12 +5150,6 @@
         </w:tc>
       </w:tr>
       <w:tr>
-        <w:tblPrEx>
-          <w:tblCellMar>
-            <w:top w:w="0" w:type="dxa"/>
-            <w:bottom w:w="0" w:type="dxa"/>
-          </w:tblCellMar>
-        </w:tblPrEx>
         <w:tc>
           <w:tcPr>
             <w:tcW w:w="1000" w:type="dxa"/>
@@ -4396,12 +5319,6 @@
         </w:tc>
       </w:tr>
       <w:tr>
-        <w:tblPrEx>
-          <w:tblCellMar>
-            <w:top w:w="0" w:type="dxa"/>
-            <w:bottom w:w="0" w:type="dxa"/>
-          </w:tblCellMar>
-        </w:tblPrEx>
         <w:tc>
           <w:tcPr>
             <w:tcW w:w="1000" w:type="dxa"/>
@@ -4571,12 +5488,6 @@
         </w:tc>
       </w:tr>
       <w:tr>
-        <w:tblPrEx>
-          <w:tblCellMar>
-            <w:top w:w="0" w:type="dxa"/>
-            <w:bottom w:w="0" w:type="dxa"/>
-          </w:tblCellMar>
-        </w:tblPrEx>
         <w:tc>
           <w:tcPr>
             <w:tcW w:w="1000" w:type="dxa"/>
@@ -4746,12 +5657,6 @@
         </w:tc>
       </w:tr>
       <w:tr>
-        <w:tblPrEx>
-          <w:tblCellMar>
-            <w:top w:w="0" w:type="dxa"/>
-            <w:bottom w:w="0" w:type="dxa"/>
-          </w:tblCellMar>
-        </w:tblPrEx>
         <w:tc>
           <w:tcPr>
             <w:tcW w:w="1000" w:type="dxa"/>
@@ -4921,12 +5826,6 @@
         </w:tc>
       </w:tr>
       <w:tr>
-        <w:tblPrEx>
-          <w:tblCellMar>
-            <w:top w:w="0" w:type="dxa"/>
-            <w:bottom w:w="0" w:type="dxa"/>
-          </w:tblCellMar>
-        </w:tblPrEx>
         <w:tc>
           <w:tcPr>
             <w:tcW w:w="1000" w:type="dxa"/>
@@ -5096,12 +5995,6 @@
         </w:tc>
       </w:tr>
       <w:tr>
-        <w:tblPrEx>
-          <w:tblCellMar>
-            <w:top w:w="0" w:type="dxa"/>
-            <w:bottom w:w="0" w:type="dxa"/>
-          </w:tblCellMar>
-        </w:tblPrEx>
         <w:tc>
           <w:tcPr>
             <w:tcW w:w="1000" w:type="dxa"/>
@@ -5271,12 +6164,6 @@
         </w:tc>
       </w:tr>
       <w:tr>
-        <w:tblPrEx>
-          <w:tblCellMar>
-            <w:top w:w="0" w:type="dxa"/>
-            <w:bottom w:w="0" w:type="dxa"/>
-          </w:tblCellMar>
-        </w:tblPrEx>
         <w:tc>
           <w:tcPr>
             <w:tcW w:w="1000" w:type="dxa"/>
@@ -5446,12 +6333,6 @@
         </w:tc>
       </w:tr>
       <w:tr>
-        <w:tblPrEx>
-          <w:tblCellMar>
-            <w:top w:w="0" w:type="dxa"/>
-            <w:bottom w:w="0" w:type="dxa"/>
-          </w:tblCellMar>
-        </w:tblPrEx>
         <w:tc>
           <w:tcPr>
             <w:tcW w:w="1000" w:type="dxa"/>
@@ -5513,8 +6394,16 @@
               <w:rPr>
                 <w:rFonts w:ascii="Cambria" w:eastAsia="Cambria" w:hAnsi="Cambria" w:cs="Cambria"/>
               </w:rPr>
-              <w:t>Missing product_id</w:t>
+              <w:t xml:space="preserve">Missing </w:t>
             </w:r>
+            <w:proofErr w:type="spellStart"/>
+            <w:r>
+              <w:rPr>
+                <w:rFonts w:ascii="Cambria" w:eastAsia="Cambria" w:hAnsi="Cambria" w:cs="Cambria"/>
+              </w:rPr>
+              <w:t>product_id</w:t>
+            </w:r>
+            <w:proofErr w:type="spellEnd"/>
           </w:p>
         </w:tc>
         <w:tc>
@@ -5621,12 +6510,6 @@
         </w:tc>
       </w:tr>
       <w:tr>
-        <w:tblPrEx>
-          <w:tblCellMar>
-            <w:top w:w="0" w:type="dxa"/>
-            <w:bottom w:w="0" w:type="dxa"/>
-          </w:tblCellMar>
-        </w:tblPrEx>
         <w:tc>
           <w:tcPr>
             <w:tcW w:w="1000" w:type="dxa"/>
@@ -5796,12 +6679,6 @@
         </w:tc>
       </w:tr>
       <w:tr>
-        <w:tblPrEx>
-          <w:tblCellMar>
-            <w:top w:w="0" w:type="dxa"/>
-            <w:bottom w:w="0" w:type="dxa"/>
-          </w:tblCellMar>
-        </w:tblPrEx>
         <w:tc>
           <w:tcPr>
             <w:tcW w:w="1000" w:type="dxa"/>
@@ -5971,12 +6848,6 @@
         </w:tc>
       </w:tr>
       <w:tr>
-        <w:tblPrEx>
-          <w:tblCellMar>
-            <w:top w:w="0" w:type="dxa"/>
-            <w:bottom w:w="0" w:type="dxa"/>
-          </w:tblCellMar>
-        </w:tblPrEx>
         <w:tc>
           <w:tcPr>
             <w:tcW w:w="1000" w:type="dxa"/>
@@ -6146,12 +7017,6 @@
         </w:tc>
       </w:tr>
       <w:tr>
-        <w:tblPrEx>
-          <w:tblCellMar>
-            <w:top w:w="0" w:type="dxa"/>
-            <w:bottom w:w="0" w:type="dxa"/>
-          </w:tblCellMar>
-        </w:tblPrEx>
         <w:tc>
           <w:tcPr>
             <w:tcW w:w="1000" w:type="dxa"/>
@@ -6357,7 +7222,23 @@
         <w:rPr>
           <w:rFonts w:ascii="Cambria" w:eastAsia="Cambria" w:hAnsi="Cambria" w:cs="Cambria"/>
         </w:rPr>
-        <w:t>Without the five business rules, a client could submit quantity 9999 for a product with only 10 in stock. The data layer would deduct 9999 from 10 and write -9989 back to the file — a permanently invalid state. Business logic acts as a gatekeeper that prevents the data layer from ever storing invalid values. Every write to products.json is preceded by validation that guarantees the resulting stock value will be zero or positive.</w:t>
+        <w:t xml:space="preserve">Without the five business rules, a client could submit quantity 9999 for a product with only 10 in stock. The data layer would deduct 9999 from 10 and write -9989 back to the file — a permanently invalid state. Business logic acts as a gatekeeper that prevents the data layer from ever storing invalid values. Every write to </w:t>
+      </w:r>
+      <w:proofErr w:type="spellStart"/>
+      <w:proofErr w:type="gramStart"/>
+      <w:r>
+        <w:rPr>
+          <w:rFonts w:ascii="Cambria" w:eastAsia="Cambria" w:hAnsi="Cambria" w:cs="Cambria"/>
+        </w:rPr>
+        <w:t>products.json</w:t>
+      </w:r>
+      <w:proofErr w:type="spellEnd"/>
+      <w:proofErr w:type="gramEnd"/>
+      <w:r>
+        <w:rPr>
+          <w:rFonts w:ascii="Cambria" w:eastAsia="Cambria" w:hAnsi="Cambria" w:cs="Cambria"/>
+        </w:rPr>
+        <w:t xml:space="preserve"> is preceded by validation that guarantees the resulting stock value will be zero or positive.</w:t>
       </w:r>
     </w:p>
     <w:p>
@@ -6390,6 +7271,7 @@
         <w:rPr>
           <w:rFonts w:ascii="Cambria" w:hAnsi="Cambria"/>
           <w:noProof/>
+          <w:lang w:eastAsia="en-PH"/>
         </w:rPr>
         <mc:AlternateContent>
           <mc:Choice Requires="wpg">
@@ -6567,8 +7449,33 @@
           <w:rFonts w:ascii="Cambria" w:hAnsi="Cambria"/>
           <w:b/>
         </w:rPr>
-        <w:t>Engr. Joao Roumil G. Vergara, CpE</w:t>
-      </w:r>
+        <w:t xml:space="preserve">Engr. Joao </w:t>
+      </w:r>
+      <w:proofErr w:type="spellStart"/>
+      <w:r>
+        <w:rPr>
+          <w:rFonts w:ascii="Cambria" w:hAnsi="Cambria"/>
+          <w:b/>
+        </w:rPr>
+        <w:t>Roumil</w:t>
+      </w:r>
+      <w:proofErr w:type="spellEnd"/>
+      <w:r>
+        <w:rPr>
+          <w:rFonts w:ascii="Cambria" w:hAnsi="Cambria"/>
+          <w:b/>
+        </w:rPr>
+        <w:t xml:space="preserve"> G. Vergara, </w:t>
+      </w:r>
+      <w:proofErr w:type="spellStart"/>
+      <w:r>
+        <w:rPr>
+          <w:rFonts w:ascii="Cambria" w:hAnsi="Cambria"/>
+          <w:b/>
+        </w:rPr>
+        <w:t>CpE</w:t>
+      </w:r>
+      <w:proofErr w:type="spellEnd"/>
     </w:p>
     <w:p>
       <w:pPr>
@@ -6644,7 +7551,55 @@
         <w:rPr>
           <w:rFonts w:ascii="Cambria" w:eastAsia="Cambria" w:hAnsi="Cambria" w:cs="Cambria"/>
         </w:rPr>
-        <w:t>Business logic was successfully isolated in the controller layer and all five rules were implemented and verified across 13 test cases. The three-layer separation — curl as presentation, Express controller as business logic, products.json as data — demonstrated that each layer can be modified independently without affecting the others. The data layer never received an invalid write because the controller intercepted and rejected every invalid request before reaching fs.writeFileSync. In a production system the data layer would be replaced by a relational database and the products.json helper functions would be replaced by a Repository class, but the business logic in the controller would remain unchanged. This confirms that proper architectural separation reduces the cost of future changes and prevents data integrity failures at the source.</w:t>
+        <w:t xml:space="preserve">Business logic was successfully isolated in the controller layer and all five rules were implemented and verified across 13 test cases. The three-layer separation — curl as presentation, Express controller as business logic, </w:t>
+      </w:r>
+      <w:proofErr w:type="spellStart"/>
+      <w:proofErr w:type="gramStart"/>
+      <w:r>
+        <w:rPr>
+          <w:rFonts w:ascii="Cambria" w:eastAsia="Cambria" w:hAnsi="Cambria" w:cs="Cambria"/>
+        </w:rPr>
+        <w:t>products.json</w:t>
+      </w:r>
+      <w:proofErr w:type="spellEnd"/>
+      <w:proofErr w:type="gramEnd"/>
+      <w:r>
+        <w:rPr>
+          <w:rFonts w:ascii="Cambria" w:eastAsia="Cambria" w:hAnsi="Cambria" w:cs="Cambria"/>
+        </w:rPr>
+        <w:t xml:space="preserve"> as data — demonstrated that each layer can be modified independently without affecting the others. The data layer never received an invalid write because the controller intercepted and rejected every invalid request before reaching </w:t>
+      </w:r>
+      <w:proofErr w:type="spellStart"/>
+      <w:proofErr w:type="gramStart"/>
+      <w:r>
+        <w:rPr>
+          <w:rFonts w:ascii="Cambria" w:eastAsia="Cambria" w:hAnsi="Cambria" w:cs="Cambria"/>
+        </w:rPr>
+        <w:t>fs.writeFileSync</w:t>
+      </w:r>
+      <w:proofErr w:type="spellEnd"/>
+      <w:proofErr w:type="gramEnd"/>
+      <w:r>
+        <w:rPr>
+          <w:rFonts w:ascii="Cambria" w:eastAsia="Cambria" w:hAnsi="Cambria" w:cs="Cambria"/>
+        </w:rPr>
+        <w:t xml:space="preserve">. In a production system the data layer would be replaced by a relational database and the </w:t>
+      </w:r>
+      <w:proofErr w:type="spellStart"/>
+      <w:proofErr w:type="gramStart"/>
+      <w:r>
+        <w:rPr>
+          <w:rFonts w:ascii="Cambria" w:eastAsia="Cambria" w:hAnsi="Cambria" w:cs="Cambria"/>
+        </w:rPr>
+        <w:t>products.json</w:t>
+      </w:r>
+      <w:proofErr w:type="spellEnd"/>
+      <w:proofErr w:type="gramEnd"/>
+      <w:r>
+        <w:rPr>
+          <w:rFonts w:ascii="Cambria" w:eastAsia="Cambria" w:hAnsi="Cambria" w:cs="Cambria"/>
+        </w:rPr>
+        <w:t xml:space="preserve"> helper functions would be replaced by a Repository class, but the business logic in the controller would remain unchanged. This confirms that proper architectural separation reduces the cost of future changes and prevents data integrity failures at the source.</w:t>
       </w:r>
     </w:p>
     <w:p>
@@ -6740,6 +7695,7 @@
         <w:rPr>
           <w:rFonts w:ascii="Cambria" w:hAnsi="Cambria"/>
           <w:noProof/>
+          <w:lang w:eastAsia="en-PH"/>
         </w:rPr>
         <mc:AlternateContent>
           <mc:Choice Requires="wpg">
@@ -6923,8 +7879,33 @@
           <w:rFonts w:ascii="Cambria" w:hAnsi="Cambria"/>
           <w:b/>
         </w:rPr>
-        <w:t>Engr. Joao Roumil G. Vergara, CpE</w:t>
-      </w:r>
+        <w:t xml:space="preserve">Engr. Joao </w:t>
+      </w:r>
+      <w:proofErr w:type="spellStart"/>
+      <w:r>
+        <w:rPr>
+          <w:rFonts w:ascii="Cambria" w:hAnsi="Cambria"/>
+          <w:b/>
+        </w:rPr>
+        <w:t>Roumil</w:t>
+      </w:r>
+      <w:proofErr w:type="spellEnd"/>
+      <w:r>
+        <w:rPr>
+          <w:rFonts w:ascii="Cambria" w:hAnsi="Cambria"/>
+          <w:b/>
+        </w:rPr>
+        <w:t xml:space="preserve"> G. Vergara, </w:t>
+      </w:r>
+      <w:proofErr w:type="spellStart"/>
+      <w:r>
+        <w:rPr>
+          <w:rFonts w:ascii="Cambria" w:hAnsi="Cambria"/>
+          <w:b/>
+        </w:rPr>
+        <w:t>CpE</w:t>
+      </w:r>
+      <w:proofErr w:type="spellEnd"/>
     </w:p>
     <w:p>
       <w:pPr>
@@ -6951,11 +7932,19 @@
           <w:rFonts w:ascii="Cambria" w:hAnsi="Cambria"/>
         </w:rPr>
       </w:pPr>
-      <w:r>
-        <w:rPr>
-          <w:rFonts w:ascii="Cambria" w:eastAsia="Cambria" w:hAnsi="Cambria" w:cs="Cambria"/>
-        </w:rPr>
-        <w:t>OpenJS Foundation. (2024). Node.js documentation. https://nodejs.org/en/docs</w:t>
+      <w:proofErr w:type="spellStart"/>
+      <w:r>
+        <w:rPr>
+          <w:rFonts w:ascii="Cambria" w:eastAsia="Cambria" w:hAnsi="Cambria" w:cs="Cambria"/>
+        </w:rPr>
+        <w:t>OpenJS</w:t>
+      </w:r>
+      <w:proofErr w:type="spellEnd"/>
+      <w:r>
+        <w:rPr>
+          <w:rFonts w:ascii="Cambria" w:eastAsia="Cambria" w:hAnsi="Cambria" w:cs="Cambria"/>
+        </w:rPr>
+        <w:t xml:space="preserve"> Foundation. (2024). Node.js documentation. https://nodejs.org/en/docs</w:t>
       </w:r>
     </w:p>
     <w:p>
@@ -6970,7 +7959,21 @@
         <w:rPr>
           <w:rFonts w:ascii="Cambria" w:eastAsia="Cambria" w:hAnsi="Cambria" w:cs="Cambria"/>
         </w:rPr>
-        <w:t>Express.js Contributors. (2024). Express: Fast, unopinionated, minimalist web framework for Node.js. https://expressjs.com</w:t>
+        <w:t xml:space="preserve">Express.js Contributors. (2024). Express: Fast, </w:t>
+      </w:r>
+      <w:proofErr w:type="spellStart"/>
+      <w:r>
+        <w:rPr>
+          <w:rFonts w:ascii="Cambria" w:eastAsia="Cambria" w:hAnsi="Cambria" w:cs="Cambria"/>
+        </w:rPr>
+        <w:t>unopinionated</w:t>
+      </w:r>
+      <w:proofErr w:type="spellEnd"/>
+      <w:r>
+        <w:rPr>
+          <w:rFonts w:ascii="Cambria" w:eastAsia="Cambria" w:hAnsi="Cambria" w:cs="Cambria"/>
+        </w:rPr>
+        <w:t>, minimalist web framework for Node.js. https://expressjs.com</w:t>
       </w:r>
     </w:p>
     <w:p>
@@ -7029,6 +8032,8 @@
           <w:rFonts w:ascii="Cambria" w:eastAsia="Cambria" w:hAnsi="Cambria" w:cs="Cambria"/>
         </w:rPr>
       </w:pPr>
+      <w:bookmarkStart w:id="0" w:name="_GoBack"/>
+      <w:bookmarkEnd w:id="0"/>
     </w:p>
     <w:p>
       <w:pPr>
@@ -7168,6 +8173,7 @@
         <w:rPr>
           <w:rFonts w:ascii="Cambria" w:hAnsi="Cambria"/>
           <w:noProof/>
+          <w:lang w:eastAsia="en-PH"/>
         </w:rPr>
         <mc:AlternateContent>
           <mc:Choice Requires="wpg">
@@ -7345,8 +8351,33 @@
           <w:rFonts w:ascii="Cambria" w:hAnsi="Cambria"/>
           <w:b/>
         </w:rPr>
-        <w:t>Engr. Joao Roumil G. Vergara, CpE</w:t>
-      </w:r>
+        <w:t xml:space="preserve">Engr. Joao </w:t>
+      </w:r>
+      <w:proofErr w:type="spellStart"/>
+      <w:r>
+        <w:rPr>
+          <w:rFonts w:ascii="Cambria" w:hAnsi="Cambria"/>
+          <w:b/>
+        </w:rPr>
+        <w:t>Roumil</w:t>
+      </w:r>
+      <w:proofErr w:type="spellEnd"/>
+      <w:r>
+        <w:rPr>
+          <w:rFonts w:ascii="Cambria" w:hAnsi="Cambria"/>
+          <w:b/>
+        </w:rPr>
+        <w:t xml:space="preserve"> G. Vergara, </w:t>
+      </w:r>
+      <w:proofErr w:type="spellStart"/>
+      <w:r>
+        <w:rPr>
+          <w:rFonts w:ascii="Cambria" w:hAnsi="Cambria"/>
+          <w:b/>
+        </w:rPr>
+        <w:t>CpE</w:t>
+      </w:r>
+      <w:proofErr w:type="spellEnd"/>
     </w:p>
     <w:p>
       <w:pPr>

</xml_diff>